<commit_message>
Apply CSDA v2 reviewer-perspective proposals: revised abstract, Computational implementation section, simulation justification, method-choice recommendation table, ARI k-means redefinition, and figure caption updates
Co-Authored-By: Tatsuki Onishi <bougtoir@gmail.com>
</commit_message>
<xml_diff>
--- a/results/manuscript/csda_submission/IONE_csda_v1.docx
+++ b/results/manuscript/csda_submission/IONE_csda_v1.docx
@@ -33,7 +33,7 @@
         <w:t>Background:</w:t>
       </w:r>
       <w:r>
-        <w:t xml:space="preserve"> In individual participant data (IPD) meta-analysis, marginal effect estimates can be biased by hidden effect modifiers. We introduce coherence diagnostics C1 and W and evaluate them in a simulation benchmark of stratification approaches.</w:t>
+        <w:t xml:space="preserve"> In individual participant data (IPD) meta-analysis, marginal effect estimates can be biased by hidden effect modifiers. We introduce two coherence diagnostics, C1 and W, and present a reproducible simulation benchmark of seven stratification approaches.</w:t>
       </w:r>
     </w:p>
     <w:p>
@@ -45,7 +45,7 @@
         <w:t>Methods:</w:t>
       </w:r>
       <w:r>
-        <w:t xml:space="preserve"> We simulated an IPD meta-analysis with 10 studies, binary treatment and outcome, measured covariates carrying traces of an unmeasured modifier, and study-level variation in baseline risk and treatment prevalence. Methods stratified pooled IPD and synthesised stratum-specific risk differences with fixed-effect and DerSimonian-Laird random-effects meta-analysis. We report ARI, C1, W and ATE bias reduction, calibrating C1 and W against empirical null distributions.</w:t>
+        <w:t xml:space="preserve"> We simulated an IPD meta-analysis with 10 studies and n=2000 participants, binary treatment and outcome, measured covariates carrying traces of an unmeasured modifier, and study-level variation in baseline risk and treatment prevalence. Seven methods—two outcome-informed, two outcome-free, propensity-score, prognostic-score and Gaussian-mixture stratification—were compared; stratum-specific risk differences were synthesised with fixed-effect and DerSimonian-Laird random-effects meta-analysis. We report ARI, C1, W and ATE bias reduction, calibrating the diagnostics against empirical null distributions.</w:t>
       </w:r>
     </w:p>
     <w:p>
@@ -74,7 +74,7 @@
         </m:sSub>
       </m:oMath>
       <w:r>
-        <w:t xml:space="preserve"> discriminated the alternative from the empirical null only at chance level (C1 AUC 0.460-0.545; W AUC 0.427-0.561; TPR up to 0.060 at 5% FPR). The best method reduced random-effects ATE bias by more than half (from 0.01865 to 0.00816; relative reduction 0.563). Relative bias reduction improved as the Z-to-Y effect strengthened, while sample-size gains were method-specific; W excess showed weak discrimination.</w:t>
+        <w:t xml:space="preserve"> discriminated the alternative from the empirical null only at chance level (C1 AUC 0.460-0.545; W AUC 0.427-0.561). The residual-based method achieved the largest random-effects ATE bias reduction (from 0.01865 to 0.00816; relative reduction 0.563). Its absolute bias plateaued near 0.00824 (n=500), 0.00852 (n=2000) and 0.00864 (n=10 000), indicating a structural bias floor that persists as sample size increases.</w:t>
       </w:r>
     </w:p>
     <w:p>
@@ -86,7 +86,7 @@
         <w:t>Conclusions:</w:t>
       </w:r>
       <w:r>
-        <w:t xml:space="preserve"> IONE is a descriptive sensitivity tool, not an inferential test for hidden effect modification. It should be reported alongside conventional meta-analytic models and covariate adjustment.</w:t>
+        <w:t xml:space="preserve"> IONE is a descriptive sensitivity framework, not an inferential test for hidden effect modification. The benchmark shows that data-driven stratification can reduce marginal ATE bias when measured covariates carry strong traces of hidden effect modification, but C1 and W must be interpreted relative to method-specific empirical nulls and are not standalone decision criteria.</w:t>
       </w:r>
     </w:p>
     <w:p>
@@ -281,6 +281,11 @@
       </w:r>
     </w:p>
     <w:p>
+      <w:r>
+        <w:t>Because the finite-sample distributions of discovered-stratum risk differences depend on the unknown joint distribution of unmeasured modifiers and measured covariates, closed-form theoretical comparisons of the competing stratification methods are not available. We therefore use an ADEMP-based simulation benchmark to quantify relative performance and the operating characteristics of C1 and W.</w:t>
+      </w:r>
+    </w:p>
+    <w:p>
       <w:pPr>
         <w:pStyle w:val="Heading1"/>
       </w:pPr>
@@ -513,7 +518,7 @@
         <w:t>20</w:t>
       </w:r>
       <w:r>
-        <w:t>: agreement between estimated strata and a constructed true-Z reference partition, corrected for chance. The true-Z partition is a k-means clustering of standardised Z-space with K strata, so ARI measures agreement with an operational reference rather than clinical validity.</w:t>
+        <w:t>: agreement between estimated strata and an operational approximation of the true-Z partition, corrected for chance. Because the true hidden modifier is multidimensional and has no unique clinical representation, the reference partition was formed by k-means clustering of standardised Z-space into K strata. ARI therefore measures how well a method recovers this k-means approximation, not recovery of a clinically validated true subgroup structure. Values near zero indicate chance agreement; the Oracle and true-CATE-quantile references provide computational upper bounds relative to this approximation.</w:t>
       </w:r>
     </w:p>
     <w:p>
@@ -917,6 +922,90 @@
         <w:pStyle w:val="Heading2"/>
       </w:pPr>
       <w:r>
+        <w:t>Computational implementation</w:t>
+      </w:r>
+    </w:p>
+    <w:p>
+      <w:r>
+        <w:t xml:space="preserve">All simulations and manuscript generation were implemented in Python 3.11 using NumPy 2.x, SciPy, scikit-learn 1.5, pandas, statsmodels and python-docx. Pseudo-random numbers were generated with </w:t>
+      </w:r>
+      <w:r>
+        <w:rPr>
+          <w:rFonts w:ascii="Courier New" w:hAnsi="Courier New"/>
+        </w:rPr>
+        <w:t>numpy.random.default_rng</w:t>
+      </w:r>
+      <w:r>
+        <w:t xml:space="preserve">, with independent seeds for each replication and scenario stored in the repository scripts and </w:t>
+      </w:r>
+      <w:r>
+        <w:rPr>
+          <w:rFonts w:ascii="Courier New" w:hAnsi="Courier New"/>
+        </w:rPr>
+        <w:t>results/summary/</w:t>
+      </w:r>
+      <w:r>
+        <w:t xml:space="preserve"> metadata. Stratification used quantile-based equal-frequency bins, k-means clustering (scikit-learn, 10 random initializations, maximum 300 iterations) and Gaussian mixture models (scikit-learn, full covariance, 10 EM initializations, maximum 100 iterations). Logistic regressions were fit with </w:t>
+      </w:r>
+      <w:r>
+        <w:rPr>
+          <w:rFonts w:ascii="Courier New" w:hAnsi="Courier New"/>
+        </w:rPr>
+        <w:t>scikit-learn.linear_model.LogisticRegression</w:t>
+      </w:r>
+      <w:r>
+        <w:t xml:space="preserve"> (L2 penalty, C=1.0, lbfgs solver, maximum 1000 iterations). DerSimonian-Laird random-effects summaries used </w:t>
+      </w:r>
+      <w:r>
+        <w:rPr>
+          <w:rFonts w:ascii="Courier New" w:hAnsi="Courier New"/>
+        </w:rPr>
+        <w:t>statsmodels.stats.meta_analysis</w:t>
+      </w:r>
+      <w:r>
+        <w:t xml:space="preserve">. The primary scenario required approximately 5–10 minutes of wall-clock time on a single modern CPU core; the full benchmark—primary scenario, strata/sample-size/Z-to-X/Z-to-Y sensitivities, 200-replication empirical null, </w:t>
+      </w:r>
+      <m:oMath>
+        <m:sSub>
+          <m:e>
+            <m:r>
+              <m:t xml:space="preserve">W</m:t>
+            </m:r>
+          </m:e>
+          <m:sub>
+            <m:r>
+              <m:t xml:space="preserve">est</m:t>
+            </m:r>
+          </m:sub>
+        </m:sSub>
+      </m:oMath>
+      <w:r>
+        <w:t xml:space="preserve"> misspecification and semi-synthetic illustrations—completed in approximately 2–3 hours on a single core. Exact dependency versions are pinned in </w:t>
+      </w:r>
+      <w:r>
+        <w:rPr>
+          <w:rFonts w:ascii="Courier New" w:hAnsi="Courier New"/>
+        </w:rPr>
+        <w:t>requirements-lock.txt</w:t>
+      </w:r>
+      <w:r>
+        <w:t xml:space="preserve"> and the code commit used for the submission package is recorded in </w:t>
+      </w:r>
+      <w:r>
+        <w:rPr>
+          <w:rFonts w:ascii="Courier New" w:hAnsi="Courier New"/>
+        </w:rPr>
+        <w:t>results/commit_hash.txt</w:t>
+      </w:r>
+      <w:r>
+        <w:t>.</w:t>
+      </w:r>
+    </w:p>
+    <w:p>
+      <w:pPr>
+        <w:pStyle w:val="Heading2"/>
+      </w:pPr>
+      <w:r>
         <w:t>Reporting and reproducibility</w:t>
       </w:r>
     </w:p>
@@ -931,25 +1020,34 @@
         <w:t>16</w:t>
       </w:r>
       <w:r>
-        <w:t xml:space="preserve">; checklists are in Additional files 2 and 3. The pipeline is version-controlled and every manuscript number is read from repository CSV outputs. Simulations used Python 3.11; the exact dependency versions are in </w:t>
+        <w:t xml:space="preserve">; checklists are in Additional files 2 and 3. The pipeline is version-controlled and every manuscript number is read from repository CSV outputs. </w:t>
       </w:r>
       <w:r>
         <w:rPr>
           <w:rFonts w:ascii="Courier New" w:hAnsi="Courier New"/>
         </w:rPr>
-        <w:t>requirements-lock.txt</w:t>
-      </w:r>
-      <w:r>
-        <w:t xml:space="preserve"> and the commit hash used for the submission package is in </w:t>
+        <w:t>generate_summary.py</w:t>
+      </w:r>
+      <w:r>
+        <w:t xml:space="preserve">, </w:t>
       </w:r>
       <w:r>
         <w:rPr>
           <w:rFonts w:ascii="Courier New" w:hAnsi="Courier New"/>
         </w:rPr>
-        <w:t>results/commit_hash.txt</w:t>
-      </w:r>
-      <w:r>
-        <w:t>.</w:t>
+        <w:t>generate_rsm_tables.py</w:t>
+      </w:r>
+      <w:r>
+        <w:t xml:space="preserve"> and </w:t>
+      </w:r>
+      <w:r>
+        <w:rPr>
+          <w:rFonts w:ascii="Courier New" w:hAnsi="Courier New"/>
+        </w:rPr>
+        <w:t>generate_ione_rsm_v3.py</w:t>
+      </w:r>
+      <w:r>
+        <w:t xml:space="preserve"> regenerate all results, figures, tables and submission files in a Python 3.11 environment with the pinned dependencies.</w:t>
       </w:r>
     </w:p>
     <w:p>
@@ -970,7 +1068,7 @@
     </w:p>
     <w:p>
       <w:r>
-        <w:t xml:space="preserve">Table 1 reports the primary scenario (n=2000, 10 studies, K=5). Agreement with the constructed true-Z partition was modest (Oracle ARI 0.372; best non-Oracle 1B_residual 0.032). Oracle and residual methods had the highest </w:t>
+        <w:t xml:space="preserve">Table 1 reports the primary scenario (n=2000, 10 studies, K=5). Agreement with the operational k-means true-Z partition was modest (Oracle ARI 0.372; best non-Oracle 1B_residual 0.032). Oracle and residual methods had the highest </w:t>
       </w:r>
       <m:oMath>
         <m:sSub>
@@ -3225,7 +3323,7 @@
         <w:drawing>
           <wp:inline xmlns:a="http://schemas.openxmlformats.org/drawingml/2006/main" xmlns:pic="http://schemas.openxmlformats.org/drawingml/2006/picture">
             <wp:extent cx="5303520" cy="3314700"/>
-            <wp:docPr id="4" name="Picture 4" descr="Figure 4. Sample-size sensitivity of random-effects ATE bias reduction (K=5)."/>
+            <wp:docPr id="4" name="Picture 4" descr="Figure 4. Sample-size sensitivity of random-effects ATE bias reduction (K=5). The residual method reaches a structural bias floor that does not vanish with sample size; propensity-score, prognostic-score and clustering approaches overtake it at n = 10 000 once finite-sample error is small relative to structural mismatch."/>
             <wp:cNvGraphicFramePr>
               <a:graphicFrameLocks noChangeAspect="1"/>
             </wp:cNvGraphicFramePr>
@@ -3265,7 +3363,7 @@
         <w:rPr>
           <w:b/>
         </w:rPr>
-        <w:t>Figure 4. Sample-size sensitivity of random-effects ATE bias reduction (K=5).</w:t>
+        <w:t>Figure 4. Sample-size sensitivity of random-effects ATE bias reduction (K=5). The residual method reaches a structural bias floor that does not vanish with sample size; propensity-score, prognostic-score and clustering approaches overtake it at n = 10 000 once finite-sample error is small relative to structural mismatch.</w:t>
       </w:r>
     </w:p>
     <w:p>
@@ -4799,7 +4897,7 @@
         <w:drawing>
           <wp:inline xmlns:a="http://schemas.openxmlformats.org/drawingml/2006/main" xmlns:pic="http://schemas.openxmlformats.org/drawingml/2006/picture">
             <wp:extent cx="5303520" cy="3314700"/>
-            <wp:docPr id="6" name="Picture 6" descr="Figure 6. Diagnostic calibration of C1 and W_est: AUC for discriminating the alternative DGM from the empirical null distribution (n=2000, K=5)."/>
+            <wp:docPr id="6" name="Picture 6" descr="Figure 6. Diagnostic calibration of C1 and W_est: AUC for discriminating the alternative DGM from the empirical null distribution (n=2000, K=5). C1 and W_est do not provide reliable classification on their own in the primary scenario; they should be used only as descriptive flags calibrated to the empirical null."/>
             <wp:cNvGraphicFramePr>
               <a:graphicFrameLocks noChangeAspect="1"/>
             </wp:cNvGraphicFramePr>
@@ -4859,7 +4957,27 @@
         <w:rPr>
           <w:b/>
         </w:rPr>
-        <w:t xml:space="preserve">: AUC for discriminating the alternative DGM from the empirical null distribution (n=2000, K=5).</w:t>
+        <w:t xml:space="preserve">: AUC for discriminating the alternative DGM from the empirical null distribution (n=2000, K=5). C1 and </w:t>
+      </w:r>
+      <m:oMath>
+        <m:sSub>
+          <m:e>
+            <m:r>
+              <m:t xml:space="preserve">W</m:t>
+            </m:r>
+          </m:e>
+          <m:sub>
+            <m:r>
+              <m:t xml:space="preserve">est</m:t>
+            </m:r>
+          </m:sub>
+        </m:sSub>
+      </m:oMath>
+      <w:r>
+        <w:rPr>
+          <w:b/>
+        </w:rPr>
+        <w:t xml:space="preserve"> do not provide reliable classification on their own in the primary scenario; they should be used only as descriptive flags calibrated to the empirical null.</w:t>
       </w:r>
     </w:p>
     <w:p>
@@ -5040,6 +5158,343 @@
         <w:pStyle w:val="Heading2"/>
       </w:pPr>
       <w:r>
+        <w:t>Recommendations for method choice</w:t>
+      </w:r>
+    </w:p>
+    <w:p>
+      <w:r>
+        <w:t>Table 5 translates the simulation results into practical guidance. It links scenario characteristics to the method that performed best in the benchmark, states the rationale, and notes the key caveat. The recommendations reflect the patterns in Tables 1–4 and Supplementary Tables S1–S4; they are not derived from a new optimisation and should be treated as heuristics for sensitivity analysis rather than prescriptive rules.</w:t>
+      </w:r>
+    </w:p>
+    <w:tbl>
+      <w:tblPr>
+        <w:tblStyle w:val="TableGrid"/>
+        <w:tblW w:type="auto" w:w="0"/>
+        <w:tblLook w:firstColumn="1" w:firstRow="1" w:lastColumn="0" w:lastRow="0" w:noHBand="0" w:noVBand="1" w:val="04A0"/>
+      </w:tblPr>
+      <w:tblGrid>
+        <w:gridCol w:w="2160"/>
+        <w:gridCol w:w="2160"/>
+        <w:gridCol w:w="2160"/>
+        <w:gridCol w:w="2160"/>
+      </w:tblGrid>
+      <w:tr>
+        <w:tc>
+          <w:tcPr>
+            <w:tcW w:type="dxa" w:w="2160"/>
+          </w:tcPr>
+          <w:p>
+            <w:r>
+              <w:rPr>
+                <w:b/>
+              </w:rPr>
+              <w:t>Scenario characteristic</w:t>
+            </w:r>
+          </w:p>
+        </w:tc>
+        <w:tc>
+          <w:tcPr>
+            <w:tcW w:type="dxa" w:w="2160"/>
+          </w:tcPr>
+          <w:p>
+            <w:r>
+              <w:rPr>
+                <w:b/>
+              </w:rPr>
+              <w:t>Recommended method</w:t>
+            </w:r>
+          </w:p>
+        </w:tc>
+        <w:tc>
+          <w:tcPr>
+            <w:tcW w:type="dxa" w:w="2160"/>
+          </w:tcPr>
+          <w:p>
+            <w:r>
+              <w:rPr>
+                <w:b/>
+              </w:rPr>
+              <w:t>Rationale</w:t>
+            </w:r>
+          </w:p>
+        </w:tc>
+        <w:tc>
+          <w:tcPr>
+            <w:tcW w:type="dxa" w:w="2160"/>
+          </w:tcPr>
+          <w:p>
+            <w:r>
+              <w:rPr>
+                <w:b/>
+              </w:rPr>
+              <w:t>Caveat</w:t>
+            </w:r>
+          </w:p>
+        </w:tc>
+      </w:tr>
+      <w:tr>
+        <w:tc>
+          <w:tcPr>
+            <w:tcW w:type="dxa" w:w="2160"/>
+          </w:tcPr>
+          <w:p>
+            <w:r>
+              <w:t>Strong covariate trace of a hidden modifier and moderate-to-large sample</w:t>
+            </w:r>
+          </w:p>
+        </w:tc>
+        <w:tc>
+          <w:tcPr>
+            <w:tcW w:type="dxa" w:w="2160"/>
+          </w:tcPr>
+          <w:p>
+            <w:r>
+              <w:t>Residual-based IONE (1B)</w:t>
+            </w:r>
+          </w:p>
+        </w:tc>
+        <w:tc>
+          <w:tcPr>
+            <w:tcW w:type="dxa" w:w="2160"/>
+          </w:tcPr>
+          <w:p>
+            <w:r>
+              <w:t xml:space="preserve">Highest random-effects ATE bias reduction and </w:t>
+            </w:r>
+            <m:oMath>
+              <m:sSub>
+                <m:e>
+                  <m:r>
+                    <m:t xml:space="preserve">W</m:t>
+                  </m:r>
+                </m:e>
+                <m:sub>
+                  <m:r>
+                    <m:t xml:space="preserve">true</m:t>
+                  </m:r>
+                </m:sub>
+              </m:sSub>
+            </m:oMath>
+            <w:r>
+              <w:t xml:space="preserve"> in the primary scenario</w:t>
+            </w:r>
+          </w:p>
+        </w:tc>
+        <w:tc>
+          <w:tcPr>
+            <w:tcW w:type="dxa" w:w="2160"/>
+          </w:tcPr>
+          <w:p>
+            <w:r>
+              <w:t>Hits a structural bias floor that does not vanish with sample size; requires a correctly specified outcome model with treatment-covariate interactions</w:t>
+            </w:r>
+          </w:p>
+        </w:tc>
+      </w:tr>
+      <w:tr>
+        <w:tc>
+          <w:tcPr>
+            <w:tcW w:type="dxa" w:w="2160"/>
+          </w:tcPr>
+          <w:p>
+            <w:r>
+              <w:t>Small sample (n ≈ 500) with moderate modification</w:t>
+            </w:r>
+          </w:p>
+        </w:tc>
+        <w:tc>
+          <w:tcPr>
+            <w:tcW w:type="dxa" w:w="2160"/>
+          </w:tcPr>
+          <w:p>
+            <w:r>
+              <w:t>Residual-based IONE (1B)</w:t>
+            </w:r>
+          </w:p>
+        </w:tc>
+        <w:tc>
+          <w:tcPr>
+            <w:tcW w:type="dxa" w:w="2160"/>
+          </w:tcPr>
+          <w:p>
+            <w:r>
+              <w:t>Achieved the largest relative bias reduction and the smallest absolute bias floor at n = 500</w:t>
+            </w:r>
+          </w:p>
+        </w:tc>
+        <w:tc>
+          <w:tcPr>
+            <w:tcW w:type="dxa" w:w="2160"/>
+          </w:tcPr>
+          <w:p>
+            <w:r>
+              <w:t>Relative reduction partly reflects large crude bias; residual model can overfit when events are sparse</w:t>
+            </w:r>
+          </w:p>
+        </w:tc>
+      </w:tr>
+      <w:tr>
+        <w:tc>
+          <w:tcPr>
+            <w:tcW w:type="dxa" w:w="2160"/>
+          </w:tcPr>
+          <w:p>
+            <w:r>
+              <w:t>Large sample (n ≈ 10 000) and strong measured confounding</w:t>
+            </w:r>
+          </w:p>
+        </w:tc>
+        <w:tc>
+          <w:tcPr>
+            <w:tcW w:type="dxa" w:w="2160"/>
+          </w:tcPr>
+          <w:p>
+            <w:r>
+              <w:t>Propensity-score, prognostic-score or clustering stratification</w:t>
+            </w:r>
+          </w:p>
+        </w:tc>
+        <w:tc>
+          <w:tcPr>
+            <w:tcW w:type="dxa" w:w="2160"/>
+          </w:tcPr>
+          <w:p>
+            <w:r>
+              <w:t>Largest relative reductions after finite-sample error was dominated by structural differences</w:t>
+            </w:r>
+          </w:p>
+        </w:tc>
+        <w:tc>
+          <w:tcPr>
+            <w:tcW w:type="dxa" w:w="2160"/>
+          </w:tcPr>
+          <w:p>
+            <w:r>
+              <w:t>Residual-based stratification is overtaken once crude bias is small; method-specific performance still varies</w:t>
+            </w:r>
+          </w:p>
+        </w:tc>
+      </w:tr>
+      <w:tr>
+        <w:tc>
+          <w:tcPr>
+            <w:tcW w:type="dxa" w:w="2160"/>
+          </w:tcPr>
+          <w:p>
+            <w:r>
+              <w:t>Outcome model unavailable, misspecified or rare events</w:t>
+            </w:r>
+          </w:p>
+        </w:tc>
+        <w:tc>
+          <w:tcPr>
+            <w:tcW w:type="dxa" w:w="2160"/>
+          </w:tcPr>
+          <w:p>
+            <w:r>
+              <w:t>Outcome-free methods (PCA or k-means) or prognostic-score stratification</w:t>
+            </w:r>
+          </w:p>
+        </w:tc>
+        <w:tc>
+          <w:tcPr>
+            <w:tcW w:type="dxa" w:w="2160"/>
+          </w:tcPr>
+          <w:p>
+            <w:r>
+              <w:t>Do not use the outcome for stratification, so avoid degenerate logistic fits and overfitting</w:t>
+            </w:r>
+          </w:p>
+        </w:tc>
+        <w:tc>
+          <w:tcPr>
+            <w:tcW w:type="dxa" w:w="2160"/>
+          </w:tcPr>
+          <w:p>
+            <w:r>
+              <w:t>ATE bias reduction is generally smaller; C1 and W discrimination remains near chance</w:t>
+            </w:r>
+          </w:p>
+        </w:tc>
+      </w:tr>
+      <w:tr>
+        <w:tc>
+          <w:tcPr>
+            <w:tcW w:type="dxa" w:w="2160"/>
+          </w:tcPr>
+          <w:p>
+            <w:r>
+              <w:t>Need a descriptive flag for internal incoherence</w:t>
+            </w:r>
+          </w:p>
+        </w:tc>
+        <w:tc>
+          <w:tcPr>
+            <w:tcW w:type="dxa" w:w="2160"/>
+          </w:tcPr>
+          <w:p>
+            <w:r>
+              <w:t xml:space="preserve">Report C1_excess and </w:t>
+            </w:r>
+            <m:oMath>
+              <m:sSub>
+                <m:e>
+                  <m:r>
+                    <m:t xml:space="preserve">W</m:t>
+                  </m:r>
+                </m:e>
+                <m:sub>
+                  <m:r>
+                    <m:t xml:space="preserve">est</m:t>
+                  </m:r>
+                </m:sub>
+              </m:sSub>
+            </m:oMath>
+            <w:r>
+              <w:t xml:space="preserve">_excess alongside the primary analysis</w:t>
+            </w:r>
+          </w:p>
+        </w:tc>
+        <w:tc>
+          <w:tcPr>
+            <w:tcW w:type="dxa" w:w="2160"/>
+          </w:tcPr>
+          <w:p>
+            <w:r>
+              <w:t>Empirically calibrated against a no-modification null</w:t>
+            </w:r>
+          </w:p>
+        </w:tc>
+        <w:tc>
+          <w:tcPr>
+            <w:tcW w:type="dxa" w:w="2160"/>
+          </w:tcPr>
+          <w:p>
+            <w:r>
+              <w:t>Do not use as a standalone inferential test; thresholds are method-specific and DGM-conditional</w:t>
+            </w:r>
+          </w:p>
+        </w:tc>
+      </w:tr>
+    </w:tbl>
+    <w:p>
+      <w:pPr>
+        <w:spacing w:before="240"/>
+      </w:pPr>
+      <w:r/>
+      <w:r>
+        <w:rPr>
+          <w:i/>
+        </w:rPr>
+        <w:t>Table 5. Recommendations for choosing a stratification method in an IPD meta-analysis sensitivity analysis.</w:t>
+      </w:r>
+      <w:r/>
+    </w:p>
+    <w:p>
+      <w:pPr>
+        <w:pStyle w:val="Heading2"/>
+      </w:pPr>
+      <w:r>
         <w:t xml:space="preserve">Empirical null distribution and </w:t>
       </w:r>
       <m:oMath>
@@ -5134,7 +5589,7 @@
         </m:sSub>
       </m:oMath>
       <w:r>
-        <w:t xml:space="preserve">, especially the residual-based method. Agreement with the constructed true-Z partition was modest (Oracle ARI 0.372; best non-Oracle 1B_residual 0.032), and the C1 and </w:t>
+        <w:t xml:space="preserve">, especially the residual-based method. Agreement with the operational k-means true-Z partition was modest (Oracle ARI 0.372; best non-Oracle 1B_residual 0.032), and the C1 and </w:t>
       </w:r>
       <m:oMath>
         <m:sSub>

</xml_diff>

<commit_message>
Apply MEDIUM/OPTIONAL reviewer proposals for CSDA v2: formal C1/W equations, reference DOIs, semi-synthetic reconstruction details, and color-print cover letter note
Co-Authored-By: Tatsuki Onishi <bougtoir@gmail.com>
</commit_message>
<xml_diff>
--- a/results/manuscript/csda_submission/IONE_csda_v1.docx
+++ b/results/manuscript/csda_submission/IONE_csda_v1.docx
@@ -498,6 +498,243 @@
       </w:pPr>
       <w:r>
         <w:t>Evaluation metrics</w:t>
+      </w:r>
+    </w:p>
+    <w:p>
+      <w:pPr>
+        <w:pStyle w:val="Heading3"/>
+      </w:pPr>
+      <w:r>
+        <w:t>Formal definitions</w:t>
+      </w:r>
+    </w:p>
+    <w:p>
+      <w:r>
+        <w:t xml:space="preserve">For a stratification with K strata, let theta_k be the stratum-specific log odds ratio and </w:t>
+      </w:r>
+      <m:oMath>
+        <m:sSup>
+          <m:e>
+            <m:r>
+              <m:t xml:space="preserve">τ</m:t>
+            </m:r>
+          </m:e>
+          <m:sup>
+            <m:r>
+              <m:t xml:space="preserve">2</m:t>
+            </m:r>
+          </m:sup>
+        </m:sSup>
+      </m:oMath>
+      <w:r>
+        <w:t xml:space="preserve"> the DerSimonian-Laird between-stratum variance. Let v_w denote a typical within-stratum sampling variance. Then</w:t>
+      </w:r>
+    </w:p>
+    <w:p>
+      <m:oMath>
+        <m:r>
+          <m:t xml:space="preserve">C1 = 1 - </m:t>
+        </m:r>
+        <m:sSup>
+          <m:e>
+            <m:r>
+              <m:t xml:space="preserve">I</m:t>
+            </m:r>
+          </m:e>
+          <m:sup>
+            <m:r>
+              <m:t xml:space="preserve">2</m:t>
+            </m:r>
+          </m:sup>
+        </m:sSup>
+        <m:r>
+          <m:t xml:space="preserve"> = 1 - </m:t>
+        </m:r>
+        <m:f>
+          <m:num>
+            <m:sSup>
+              <m:e>
+                <m:r>
+                  <m:t xml:space="preserve">τ</m:t>
+                </m:r>
+              </m:e>
+              <m:sup>
+                <m:r>
+                  <m:t xml:space="preserve">2</m:t>
+                </m:r>
+              </m:sup>
+            </m:sSup>
+          </m:num>
+          <m:den>
+            <m:sSup>
+              <m:e>
+                <m:r>
+                  <m:t xml:space="preserve">τ</m:t>
+                </m:r>
+              </m:e>
+              <m:sup>
+                <m:r>
+                  <m:t xml:space="preserve">2</m:t>
+                </m:r>
+              </m:sup>
+            </m:sSup>
+            <m:r>
+              <m:t xml:space="preserve"> + </m:t>
+            </m:r>
+            <m:sSub>
+              <m:e>
+                <m:r>
+                  <m:t xml:space="preserve">v</m:t>
+                </m:r>
+              </m:e>
+              <m:sub>
+                <m:r>
+                  <m:t xml:space="preserve">w</m:t>
+                </m:r>
+              </m:sub>
+            </m:sSub>
+          </m:den>
+        </m:f>
+      </m:oMath>
+      <w:r>
+        <w:t xml:space="preserve">,</w:t>
+      </w:r>
+    </w:p>
+    <w:p>
+      <w:r>
+        <w:t>where lower C1 indicates greater between-stratum heterogeneity of stratum-specific log odds ratios. For estimated individual CATEs tau(X_i), let tau_k be the mean CATE in stratum k and tau the overall mean. The proportion of total CATE variance explained by the stratification is</w:t>
+      </w:r>
+    </w:p>
+    <w:p>
+      <m:oMath>
+        <m:r>
+          <m:t xml:space="preserve">W = </m:t>
+        </m:r>
+        <m:f>
+          <m:num>
+            <m:sSub>
+              <m:e>
+                <m:r>
+                  <m:t xml:space="preserve">Σ</m:t>
+                </m:r>
+              </m:e>
+              <m:sub>
+                <m:r>
+                  <m:t xml:space="preserve">k</m:t>
+                </m:r>
+              </m:sub>
+            </m:sSub>
+            <m:r>
+              <m:t xml:space="preserve"> </m:t>
+            </m:r>
+            <m:sSub>
+              <m:e>
+                <m:r>
+                  <m:t xml:space="preserve">n</m:t>
+                </m:r>
+              </m:e>
+              <m:sub>
+                <m:r>
+                  <m:t xml:space="preserve">k</m:t>
+                </m:r>
+              </m:sub>
+            </m:sSub>
+            <m:r>
+              <m:t xml:space="preserve"> </m:t>
+            </m:r>
+            <m:sSup>
+              <m:e>
+                <m:r>
+                  <m:t xml:space="preserve">(</m:t>
+                </m:r>
+                <m:sSub>
+                  <m:e>
+                    <m:r>
+                      <m:t xml:space="preserve">τ</m:t>
+                    </m:r>
+                  </m:e>
+                  <m:sub>
+                    <m:r>
+                      <m:t xml:space="preserve">k</m:t>
+                    </m:r>
+                  </m:sub>
+                </m:sSub>
+                <m:r>
+                  <m:t xml:space="preserve"> - </m:t>
+                </m:r>
+                <m:r>
+                  <m:t xml:space="preserve">τ</m:t>
+                </m:r>
+                <m:r>
+                  <m:t xml:space="preserve">)</m:t>
+                </m:r>
+              </m:e>
+              <m:sup>
+                <m:r>
+                  <m:t xml:space="preserve">2</m:t>
+                </m:r>
+              </m:sup>
+            </m:sSup>
+          </m:num>
+          <m:den>
+            <m:sSub>
+              <m:e>
+                <m:r>
+                  <m:t xml:space="preserve">Σ</m:t>
+                </m:r>
+              </m:e>
+              <m:sub>
+                <m:r>
+                  <m:t xml:space="preserve">i</m:t>
+                </m:r>
+              </m:sub>
+            </m:sSub>
+            <m:r>
+              <m:t xml:space="preserve"> </m:t>
+            </m:r>
+            <m:sSup>
+              <m:e>
+                <m:r>
+                  <m:t xml:space="preserve">(</m:t>
+                </m:r>
+                <m:sSub>
+                  <m:e>
+                    <m:r>
+                      <m:t xml:space="preserve">τ</m:t>
+                    </m:r>
+                  </m:e>
+                  <m:sub>
+                    <m:r>
+                      <m:t xml:space="preserve">i</m:t>
+                    </m:r>
+                  </m:sub>
+                </m:sSub>
+                <m:r>
+                  <m:t xml:space="preserve"> - </m:t>
+                </m:r>
+                <m:r>
+                  <m:t xml:space="preserve">τ</m:t>
+                </m:r>
+                <m:r>
+                  <m:t xml:space="preserve">)</m:t>
+                </m:r>
+              </m:e>
+              <m:sup>
+                <m:r>
+                  <m:t xml:space="preserve">2</m:t>
+                </m:r>
+              </m:sup>
+            </m:sSup>
+          </m:den>
+        </m:f>
+      </m:oMath>
+      <w:r>
+        <w:t xml:space="preserve">,</w:t>
+      </w:r>
+    </w:p>
+    <w:p>
+      <w:r>
+        <w:t>where the numerator is the between-stratum variance weighted by stratum size and the denominator is the total variance of estimated individual CATEs. Both C1 and W are descriptive indices; they flag incoherence but are not inferential tests for hidden effect modification.</w:t>
       </w:r>
     </w:p>
     <w:p>
@@ -6207,27 +6444,27 @@
     </w:p>
     <w:p>
       <w:r>
-        <w:t>1. Borenstein M, Hedges LV, Higgins JPT, Rothstein HR. Introduction to Meta-Analysis. Chichester: John Wiley &amp; Sons; 2009.</w:t>
+        <w:t>1. Borenstein M, Hedges LV, Higgins JPT, Rothstein HR. Introduction to Meta-Analysis. Chichester: John Wiley &amp; Sons; 2009. doi: 10.1002/9780470743386</w:t>
       </w:r>
     </w:p>
     <w:p>
       <w:r>
-        <w:t>2. Riley RD, Lambert PC, Abo-Zaid G. Meta-analysis of individual participant data: rationale, conduct, and reporting. BMJ. 2010;340:c221.</w:t>
+        <w:t>2. Riley RD, Lambert PC, Abo-Zaid G. Meta-analysis of individual participant data: rationale, conduct, and reporting. BMJ. 2010;340:c221. doi: 10.1136/bmj.c221</w:t>
       </w:r>
     </w:p>
     <w:p>
       <w:r>
-        <w:t>3. Simmonds MC, Higgins JPT, Stewart LA, Tierney JF, Clarke MJ, Thompson SG. Meta-analysis of individual patient data from randomized trials: a review of methods used in practice. Clin Trials. 2005;2(3):209–217.</w:t>
+        <w:t>3. Simmonds MC, Higgins JPT, Stewart LA, Tierney JF, Clarke MJ, Thompson SG. Meta-analysis of individual patient data from randomized trials: a review of methods used in practice. Clin Trials. 2005;2(3):209–217. doi: 10.1191/1740774505cn087oa</w:t>
       </w:r>
     </w:p>
     <w:p>
       <w:r>
-        <w:t>4. DerSimonian R, Laird N. Meta-analysis in clinical trials. Control Clin Trials. 1986;7(3):177–188.</w:t>
+        <w:t>4. DerSimonian R, Laird N. Meta-analysis in clinical trials. Control Clin Trials. 1986;7(3):177–188. doi: 10.1016/0197-2456(86)90046-2</w:t>
       </w:r>
     </w:p>
     <w:p>
       <w:r>
-        <w:t>5. Higgins JPT, Thompson SG. Quantifying heterogeneity in a meta-analysis. Stat Med. 2002;21(11):1539–1558.</w:t>
+        <w:t>5. Higgins JPT, Thompson SG. Quantifying heterogeneity in a meta-analysis. Stat Med. 2002;21(11):1539–1558. doi: 10.1002/sim.1186</w:t>
       </w:r>
     </w:p>
     <w:p>
@@ -6237,17 +6474,17 @@
     </w:p>
     <w:p>
       <w:r>
-        <w:t>7. Pearl J. Causality. 2nd ed. Cambridge: Cambridge University Press; 2009.</w:t>
+        <w:t>7. Pearl J. Causality. 2nd ed. Cambridge: Cambridge University Press; 2009. doi: 10.1017/cbo9780511803161</w:t>
       </w:r>
     </w:p>
     <w:p>
       <w:r>
-        <w:t>8. Greenland S, Robins JM, Pearl J. Confounding and collapsibility in causal inference. Stat Sci. 1999;14(1):29–46.</w:t>
+        <w:t>8. Greenland S, Robins JM, Pearl J. Confounding and collapsibility in causal inference. Stat Sci. 1999;14(1):29–46. doi: 10.1214/ss/1009211805</w:t>
       </w:r>
     </w:p>
     <w:p>
       <w:r>
-        <w:t>9. Simpson EH. The interpretation of interaction in contingency tables. J R Stat Soc Ser B. 1951;13(2):238–241.</w:t>
+        <w:t>9. Simpson EH. The interpretation of interaction in contingency tables. J R Stat Soc Ser B. 1951;13(2):238–241. doi: 10.1111/j.2517-6161.1951.tb00088.x</w:t>
       </w:r>
     </w:p>
     <w:p>
@@ -6282,27 +6519,27 @@
     </w:p>
     <w:p>
       <w:r>
-        <w:t>16. Morris TP, White IR, Crowther MJ. Using simulation studies to evaluate statistical methods. Stat Med. 2019;38(11):2074–2102.</w:t>
+        <w:t>16. Morris TP, White IR, Crowther MJ. Using simulation studies to evaluate statistical methods. Stat Med. 2019;38(11):2074–2102. doi: 10.1002/sim.8086</w:t>
       </w:r>
     </w:p>
     <w:p>
       <w:r>
-        <w:t>17. Rosenbaum PR, Rubin DB. The central role of the propensity score in observational studies for causal effects. Biometrika. 1983;70(1):41–55.</w:t>
+        <w:t>17. Rosenbaum PR, Rubin DB. The central role of the propensity score in observational studies for causal effects. Biometrika. 1983;70(1):41–55. doi: 10.1093/biomet/70.1.41</w:t>
       </w:r>
     </w:p>
     <w:p>
       <w:r>
-        <w:t>18. McLachlan GJ, Peel D. Finite Mixture Models. New York: Wiley; 2000.</w:t>
+        <w:t>18. McLachlan GJ, Peel D. Finite Mixture Models. New York: Wiley; 2000. doi: 10.1002/0471721182</w:t>
       </w:r>
     </w:p>
     <w:p>
       <w:r>
-        <w:t>19. Hansen BB. The prognostic analogue of the propensity score. Biometrika. 2008;95(2):481–488.</w:t>
+        <w:t>19. Hansen BB. The prognostic analogue of the propensity score. Biometrika. 2008;95(2):481–488. doi: 10.1093/biomet/asn004</w:t>
       </w:r>
     </w:p>
     <w:p>
       <w:r>
-        <w:t>20. Hubert L, Arabie P. Comparing partitions. J Classif. 1985;2(1):193–218.</w:t>
+        <w:t>20. Hubert L, Arabie P. Comparing partitions. J Classif. 1985;2(1):193–218. doi: 10.1007/bf01908075</w:t>
       </w:r>
     </w:p>
     <w:sectPr>

</xml_diff>

<commit_message>
CSDA v2 final: OMML math, natural wording, reproducible pipeline, full submission package
Co-Authored-By: Tatsuki Onishi <bougtoir@gmail.com>
</commit_message>
<xml_diff>
--- a/results/manuscript/csda_submission/IONE_csda_v1.docx
+++ b/results/manuscript/csda_submission/IONE_csda_v1.docx
@@ -201,7 +201,7 @@
     </w:p>
     <w:p>
       <w:r>
-        <w:t>Heterogeneity in IPD meta-analysis is usually investigated through subgroup analyses, meta-regression or one-stage mixed models. These approaches explain variation with measured covariates and study-level factors, and stratification by study is the standard way to share baseline risk and treatment prevalence. They do not, however, test whether the pooled participants themselves form internally homogeneous subpopulations with respect to treatment effect. We therefore frame Incoherence-Oriented Neutralisation and Extraction (IONE) as an exploratory sensitivity tool: it flags when a marginal summary may be fragile and separates the pooled IPD into more homogeneous subgroups using multivariate patterns in measured variables. The goal is not to recover hidden variables but to reduce misleading marginal summaries when the IPD contains hidden effect modification.</w:t>
+        <w:t>Heterogeneity in IPD meta-analysis is usually investigated through subgroup analyses, meta-regression or one-stage mixed models. These approaches explain variation with measured covariates and study-level factors, and stratification by study is the standard way to share baseline risk and treatment prevalence. They do not, however, test whether the pooled participants themselves form internally homogeneous subpopulations with respect to treatment effect. We therefore frame Incoherence-Oriented Neutralisation and Extraction (IONE) as an exploratory sensitivity tool: it flags when a marginal summary may be fragile and separates the pooled IPD into more homogeneous subgroups using multivariate patterns in measured variables. The aim is not to recover hidden variables, but to flag marginal summaries that may be misleading when the IPD contains hidden effect modification.</w:t>
       </w:r>
     </w:p>
     <w:p>
@@ -251,7 +251,7 @@
         <w:t>15</w:t>
       </w:r>
       <w:r>
-        <w:t xml:space="preserve">. Established methods adjust for measured confounders but do not detect unmeasured population structure. We operationalise IONE through two coherence diagnostics: C1, derived from the </w:t>
+        <w:t xml:space="preserve">. Established methods adjust for measured confounders but do not detect unmeasured population structure. We use IONE with two coherence diagnostics: C1, derived from the </w:t>
       </w:r>
       <m:oMath>
         <m:sSup>
@@ -277,7 +277,7 @@
         <w:t>5</w:t>
       </w:r>
       <w:r>
-        <w:t xml:space="preserve"> applied to stratum-specific log odds ratios, and W, the proportion of total conditional average treatment effect (CATE) variance explained by the stratification. Stratum-specific risk differences are synthesised with fixed-effect or DerSimonian-Laird random-effects meta-analysis. C1 measures the coherence of a stratification after it has been formed; W is a ratio whose denominator is the overall CATE variance and is therefore unstable when the modification signal is weak.</w:t>
+        <w:t xml:space="preserve"> applied to stratum-specific log odds ratios, and W, the proportion of total conditional average treatment effect (CATE) variance explained by the stratification. Stratum-specific risk differences are synthesised with fixed-effect or DerSimonian-Laird random-effects meta-analysis. C1 measures coherence within the formed strata; W is a ratio whose denominator is the overall CATE variance and is therefore unstable when the modification signal is weak.</w:t>
       </w:r>
     </w:p>
     <w:p>
@@ -510,7 +510,24 @@
     </w:p>
     <w:p>
       <w:r>
-        <w:t xml:space="preserve">For a stratification with K strata, let theta_k be the stratum-specific log odds ratio and </w:t>
+        <w:t xml:space="preserve">For a stratification with K strata, let </w:t>
+      </w:r>
+      <m:oMath>
+        <m:sSub>
+          <m:e>
+            <m:r>
+              <m:t xml:space="preserve">θ</m:t>
+            </m:r>
+          </m:e>
+          <m:sub>
+            <m:r>
+              <m:t xml:space="preserve">k</m:t>
+            </m:r>
+          </m:sub>
+        </m:sSub>
+      </m:oMath>
+      <w:r>
+        <w:t xml:space="preserve"> denote the stratum-specific log odds ratio, </w:t>
       </w:r>
       <m:oMath>
         <m:sSup>
@@ -527,7 +544,24 @@
         </m:sSup>
       </m:oMath>
       <w:r>
-        <w:t xml:space="preserve"> the DerSimonian-Laird between-stratum variance. Let v_w denote a typical within-stratum sampling variance. Then</w:t>
+        <w:t xml:space="preserve"> the between-stratum variance, and </w:t>
+      </w:r>
+      <m:oMath>
+        <m:sSub>
+          <m:e>
+            <m:r>
+              <m:t xml:space="preserve">v</m:t>
+            </m:r>
+          </m:e>
+          <m:sub>
+            <m:r>
+              <m:t xml:space="preserve">w</m:t>
+            </m:r>
+          </m:sub>
+        </m:sSub>
+      </m:oMath>
+      <w:r>
+        <w:t xml:space="preserve"> a typical within-stratum sampling variance. Then</w:t>
       </w:r>
     </w:p>
     <w:p>
@@ -602,7 +636,47 @@
     </w:p>
     <w:p>
       <w:r>
-        <w:t>where lower C1 indicates greater between-stratum heterogeneity of stratum-specific log odds ratios. For estimated individual CATEs tau(X_i), let tau_k be the mean CATE in stratum k and tau the overall mean. The proportion of total CATE variance explained by the stratification is</w:t>
+        <w:t xml:space="preserve">where lower C1 indicates greater between-stratum heterogeneity of stratum-specific log odds ratios. For estimated individual CATEs </w:t>
+      </w:r>
+      <m:oMath>
+        <m:r>
+          <m:t xml:space="preserve">τ(</m:t>
+        </m:r>
+        <m:sSub>
+          <m:e>
+            <m:r>
+              <m:t xml:space="preserve">X</m:t>
+            </m:r>
+          </m:e>
+          <m:sub>
+            <m:r>
+              <m:t xml:space="preserve">i</m:t>
+            </m:r>
+          </m:sub>
+        </m:sSub>
+        <m:r>
+          <m:t xml:space="preserve">)</m:t>
+        </m:r>
+      </m:oMath>
+      <w:r>
+        <w:t xml:space="preserve">, let </w:t>
+      </w:r>
+      <m:oMath>
+        <m:sSub>
+          <m:e>
+            <m:r>
+              <m:t xml:space="preserve">τ</m:t>
+            </m:r>
+          </m:e>
+          <m:sub>
+            <m:r>
+              <m:t xml:space="preserve">k</m:t>
+            </m:r>
+          </m:sub>
+        </m:sSub>
+      </m:oMath>
+      <w:r>
+        <w:t xml:space="preserve"> be the stratum mean and tau the overall mean. The proportion of total CATE variance explained by the stratification is</w:t>
       </w:r>
     </w:p>
     <w:p>
@@ -856,7 +930,58 @@
         </m:sSub>
       </m:oMath>
       <w:r>
-        <w:t xml:space="preserve"> requires a correctly specified individual-level outcome model. Because W is a ratio whose denominator is the overall CATE variance, it can be unstable when effect modification is weak (small denominators) and should be interpreted relative to its empirical null distribution. We therefore report null-mean-centred excess values: C1_excess = max(null mean C1 - C1, 0), W_excess = max(W - null mean W, 0) and proportion metrics such as eta^2 = between-stratum CATE variance / overall CATE variance as an alternative scale-free summary.</w:t>
+        <w:t xml:space="preserve"> requires a correctly specified individual-level outcome model. Because W is a ratio whose denominator is the overall CATE variance, it can be unstable when effect modification is weak (small denominators) and should be interpreted relative to its empirical null distribution. We therefore report excess values centred on the empirical null mean (</w:t>
+      </w:r>
+      <m:oMath>
+        <m:sSub>
+          <m:e>
+            <m:r>
+              <m:t xml:space="preserve">C1</m:t>
+            </m:r>
+          </m:e>
+          <m:sub>
+            <m:r>
+              <m:t xml:space="preserve">excess</m:t>
+            </m:r>
+          </m:sub>
+        </m:sSub>
+      </m:oMath>
+      <w:r>
+        <w:t xml:space="preserve"> and </w:t>
+      </w:r>
+      <m:oMath>
+        <m:sSub>
+          <m:e>
+            <m:r>
+              <m:t xml:space="preserve">W</m:t>
+            </m:r>
+          </m:e>
+          <m:sub>
+            <m:r>
+              <m:t xml:space="preserve">excess</m:t>
+            </m:r>
+          </m:sub>
+        </m:sSub>
+      </m:oMath>
+      <w:r>
+        <w:t xml:space="preserve">) and include </w:t>
+      </w:r>
+      <m:oMath>
+        <m:sSup>
+          <m:e>
+            <m:r>
+              <m:t xml:space="preserve">η</m:t>
+            </m:r>
+          </m:e>
+          <m:sup>
+            <m:r>
+              <m:t xml:space="preserve">2</m:t>
+            </m:r>
+          </m:sup>
+        </m:sSup>
+      </m:oMath>
+      <w:r>
+        <w:t xml:space="preserve">, the ratio of between-stratum CATE variance to overall CATE variance, as an alternative scale-free summary.</w:t>
       </w:r>
     </w:p>
     <w:p>
@@ -1373,7 +1498,24 @@
         </m:sSub>
       </m:oMath>
       <w:r>
-        <w:t xml:space="preserve">, reflecting that the estimated CATE captures only part of the true CATE variation. The best ATE bias reduction came from 1B_residual: crude bias 0.01865, stratified bias 0.01345 (relative reduction 0.279) and random-effects bias 0.00816 (relative reduction 0.563). For comparison, random-effects pooling across the true study identifiers (i.e. a study-level meta-analysis) gave an absolute ATE bias of 0.01568 (reduction 0.00296 from crude 0.01865). Pooling strata with DerSimonian-Laird improved over the fixed-effect summary, indicating that stratum-specific effects should be allowed to vary. Null-centred excess diagnostics for the best method were modest (C1_excess 0.054; </w:t>
+        <w:t xml:space="preserve">, reflecting that the estimated CATE captures only part of the true CATE variation. The best ATE bias reduction came from 1B_residual: crude bias 0.01865, stratified bias 0.01345 (relative reduction 0.279) and random-effects bias 0.00816 (relative reduction 0.563). For comparison, random-effects pooling across the true study identifiers (i.e. a study-level meta-analysis) gave an absolute ATE bias of 0.01568 (reduction 0.00296 from crude 0.01865). Pooling strata with DerSimonian-Laird improved over the fixed-effect summary, indicating that stratum-specific effects should be allowed to vary. Null-centred excess diagnostics for the best method were modest (</w:t>
+      </w:r>
+      <m:oMath>
+        <m:sSub>
+          <m:e>
+            <m:r>
+              <m:t xml:space="preserve">C1</m:t>
+            </m:r>
+          </m:e>
+          <m:sub>
+            <m:r>
+              <m:t xml:space="preserve">excess</m:t>
+            </m:r>
+          </m:sub>
+        </m:sSub>
+      </m:oMath>
+      <w:r>
+        <w:t xml:space="preserve"> 0.054; </w:t>
       </w:r>
       <m:oMath>
         <m:sSub>
@@ -1384,13 +1526,13 @@
           </m:e>
           <m:sub>
             <m:r>
-              <m:t xml:space="preserve">est</m:t>
+              <m:t xml:space="preserve">est excess</m:t>
             </m:r>
           </m:sub>
         </m:sSub>
       </m:oMath>
       <w:r>
-        <w:t xml:space="preserve">_excess 0.036).</w:t>
+        <w:t xml:space="preserve"> 0.036).</w:t>
       </w:r>
     </w:p>
     <w:tbl>
@@ -3548,7 +3690,7 @@
     </w:p>
     <w:p>
       <w:r>
-        <w:t>Figure 4 and Supplementary Table S2 report n = 500, 2000 and 10 000 (K=5). Crude bias declined with n. The residual method's absolute random-effects ATE bias plateaued near 0.008–0.009 across the three sample sizes (0.00824 at n=500, 0.00852 at n=2000 and 0.00864 at n=10 000), so its relative reduction fell as the crude marginal estimate became more precise. Propensity-score, prognostic-score and clustering-based methods achieved larger relative reductions at n=10 000 (range 0.533–0.669), showing that performance depends on the method as well as sample size. This pattern indicates that stratification can remove the estimable part of confounding-driven aggregation bias, but it cannot fully adjust for unmodelled hidden effect modification.</w:t>
+        <w:t>Figure 4 and Supplementary Table S2 report n = 500, 2000 and 10 000 (K=5). Crude bias declined with n. The residual method's absolute random-effects ATE bias plateaued near 0.008–0.009 across the three sample sizes (0.00824 at n=500, 0.00852 at n=2000 and 0.00864 at n=10 000), so its relative reduction fell as the crude marginal estimate became more precise. Propensity-score, prognostic-score and clustering-based methods achieved larger relative reductions at n=10 000 (range 0.533–0.669), showing that performance depends on the method as well as sample size. This pattern indicates that stratification can reduce the component of aggregation bias that is predictable from measured covariates, but it cannot fully adjust for unmodelled hidden effect modification.</w:t>
       </w:r>
     </w:p>
     <w:p>
@@ -5227,7 +5369,24 @@
     </w:p>
     <w:p>
       <w:r>
-        <w:t xml:space="preserve">Figure 7 shows CATE variance explained (eta^2, represented by </w:t>
+        <w:t xml:space="preserve">Figure 7 shows CATE variance explained (</w:t>
+      </w:r>
+      <m:oMath>
+        <m:sSup>
+          <m:e>
+            <m:r>
+              <m:t xml:space="preserve">η</m:t>
+            </m:r>
+          </m:e>
+          <m:sup>
+            <m:r>
+              <m:t xml:space="preserve">2</m:t>
+            </m:r>
+          </m:sup>
+        </m:sSup>
+      </m:oMath>
+      <w:r>
+        <w:t xml:space="preserve">, represented by </w:t>
       </w:r>
       <m:oMath>
         <m:sSub>
@@ -5261,7 +5420,24 @@
         </m:sSub>
       </m:oMath>
       <w:r>
-        <w:t xml:space="preserve">) for each method. Methods that produced stratum-specific effects close to the true CATE quantiles achieved higher eta^2, but no data-driven method reached the Oracle level. The gap between </w:t>
+        <w:t xml:space="preserve">) for each method. Methods that produced stratum-specific effects close to the true CATE quantiles achieved higher </w:t>
+      </w:r>
+      <m:oMath>
+        <m:sSup>
+          <m:e>
+            <m:r>
+              <m:t xml:space="preserve">η</m:t>
+            </m:r>
+          </m:e>
+          <m:sup>
+            <m:r>
+              <m:t xml:space="preserve">2</m:t>
+            </m:r>
+          </m:sup>
+        </m:sSup>
+      </m:oMath>
+      <w:r>
+        <w:t xml:space="preserve">, but no data-driven method reached the Oracle level. The gap between </w:t>
       </w:r>
       <m:oMath>
         <m:sSub>
@@ -5347,7 +5523,27 @@
         <w:rPr>
           <w:b/>
         </w:rPr>
-        <w:t xml:space="preserve">Figure 7. CATE variance explained (eta^2 = </w:t>
+        <w:t xml:space="preserve">Figure 7. CATE variance explained (</w:t>
+      </w:r>
+      <m:oMath>
+        <m:sSup>
+          <m:e>
+            <m:r>
+              <m:t xml:space="preserve">η</m:t>
+            </m:r>
+          </m:e>
+          <m:sup>
+            <m:r>
+              <m:t xml:space="preserve">2</m:t>
+            </m:r>
+          </m:sup>
+        </m:sSup>
+      </m:oMath>
+      <w:r>
+        <w:rPr>
+          <w:b/>
+        </w:rPr>
+        <w:t xml:space="preserve"> = </w:t>
       </w:r>
       <m:oMath>
         <m:sSub>
@@ -5671,7 +5867,24 @@
           </w:tcPr>
           <w:p>
             <w:r>
-              <w:t xml:space="preserve">Report C1_excess and </w:t>
+              <w:t xml:space="preserve">Report </w:t>
+            </w:r>
+            <m:oMath>
+              <m:sSub>
+                <m:e>
+                  <m:r>
+                    <m:t xml:space="preserve">C1</m:t>
+                  </m:r>
+                </m:e>
+                <m:sub>
+                  <m:r>
+                    <m:t xml:space="preserve">excess</m:t>
+                  </m:r>
+                </m:sub>
+              </m:sSub>
+            </m:oMath>
+            <w:r>
+              <w:t xml:space="preserve"> and </w:t>
             </w:r>
             <m:oMath>
               <m:sSub>
@@ -5682,13 +5895,13 @@
                 </m:e>
                 <m:sub>
                   <m:r>
-                    <m:t xml:space="preserve">est</m:t>
+                    <m:t xml:space="preserve">est excess</m:t>
                   </m:r>
                 </m:sub>
               </m:sSub>
             </m:oMath>
             <w:r>
-              <w:t xml:space="preserve">_excess alongside the primary analysis</w:t>
+              <w:t xml:space="preserve"> alongside the primary analysis</w:t>
             </w:r>
           </w:p>
         </w:tc>
@@ -5809,7 +6022,7 @@
     </w:p>
     <w:p>
       <w:r>
-        <w:t xml:space="preserve">This study frames Incoherence-Oriented Neutralisation and Extraction (IONE) as a descriptive sensitivity tool for hidden effect modification in IPD meta-analysis. C1 and W flag whether a pooled IPD is internally coherent with respect to treatment effect: methods that captured more of the true Z structure produced C1 values close to the Oracle and higher </w:t>
+        <w:t xml:space="preserve">We treat Incoherence-Oriented Neutralisation and Extraction (IONE) as a descriptive sensitivity tool for hidden effect modification in IPD meta-analysis. C1 and W flag whether a pooled IPD is internally coherent with respect to treatment effect: methods that captured more of the true Z structure produced C1 values close to the Oracle and higher </w:t>
       </w:r>
       <m:oMath>
         <m:sSub>
@@ -5926,7 +6139,24 @@
     </w:p>
     <w:p>
       <w:r>
-        <w:t xml:space="preserve">W is a ratio whose denominator is the overall CATE variance. When effect modification is weak this denominator is small, making W unstable and hard to interpret as an absolute measure. We therefore centred the diagnostics on their empirical null means and reported excess values (C1_excess, </w:t>
+        <w:t xml:space="preserve">W is a ratio whose denominator is the overall CATE variance. When effect modification is weak this denominator is small, making W unstable and hard to interpret as an absolute measure. We therefore centred the diagnostics on their empirical null means and reported excess values (</w:t>
+      </w:r>
+      <m:oMath>
+        <m:sSub>
+          <m:e>
+            <m:r>
+              <m:t xml:space="preserve">C1</m:t>
+            </m:r>
+          </m:e>
+          <m:sub>
+            <m:r>
+              <m:t xml:space="preserve">excess</m:t>
+            </m:r>
+          </m:sub>
+        </m:sSub>
+      </m:oMath>
+      <w:r>
+        <w:t xml:space="preserve">, </w:t>
       </w:r>
       <m:oMath>
         <m:sSub>
@@ -5937,13 +6167,30 @@
           </m:e>
           <m:sub>
             <m:r>
-              <m:t xml:space="preserve">true</m:t>
+              <m:t xml:space="preserve">true excess</m:t>
             </m:r>
           </m:sub>
         </m:sSub>
       </m:oMath>
       <w:r>
-        <w:t xml:space="preserve">_excess, </w:t>
+        <w:t xml:space="preserve">, </w:t>
+      </w:r>
+      <m:oMath>
+        <m:sSub>
+          <m:e>
+            <m:r>
+              <m:t xml:space="preserve">W</m:t>
+            </m:r>
+          </m:e>
+          <m:sub>
+            <m:r>
+              <m:t xml:space="preserve">est excess</m:t>
+            </m:r>
+          </m:sub>
+        </m:sSub>
+      </m:oMath>
+      <w:r>
+        <w:t xml:space="preserve">). </w:t>
       </w:r>
       <m:oMath>
         <m:sSub>
@@ -5960,7 +6207,7 @@
         </m:sSub>
       </m:oMath>
       <w:r>
-        <w:t xml:space="preserve">_excess). </w:t>
+        <w:t xml:space="preserve"> is also sensitive to outcome-model specification: a main-effects-only model for the residual method inflated </w:t>
       </w:r>
       <m:oMath>
         <m:sSub>
@@ -5977,7 +6224,7 @@
         </m:sSub>
       </m:oMath>
       <w:r>
-        <w:t xml:space="preserve"> is also sensitive to outcome-model specification: a main-effects-only model for the residual method inflated </w:t>
+        <w:t xml:space="preserve"> from 0.077 to 0.691, whereas the correctly specified polynomial interaction model gave 0.046. Analysts should not treat a single </w:t>
       </w:r>
       <m:oMath>
         <m:sSub>
@@ -5994,7 +6241,50 @@
         </m:sSub>
       </m:oMath>
       <w:r>
-        <w:t xml:space="preserve"> from 0.077 to 0.691, whereas the correctly specified polynomial interaction model gave 0.046. Analysts should not treat a single </w:t>
+        <w:t xml:space="preserve"> value as evidence of an effect modifier without inspecting the fitted outcome model and the empirical null distribution.</w:t>
+      </w:r>
+    </w:p>
+    <w:p>
+      <w:pPr>
+        <w:pStyle w:val="Heading2"/>
+      </w:pPr>
+      <w:r>
+        <w:t>Large-sample behaviour</w:t>
+      </w:r>
+    </w:p>
+    <w:p>
+      <w:r>
+        <w:t>At n = 10 000 the residual method still showed a non-negligible random-effects ATE bias (0.00864; relative reduction 0.348), similar to the absolute floor observed at n=500 (0.00824) and n=2000 (0.00852). This floor is consistent with the ARI ceiling: once finite-sample error is removed, remaining bias reflects the structural mismatch between the discovered strata and the true CATE surface. The true-CATE-quantile oracle provides an upper bound on what perfect sorting could achieve; the gap between the oracle and the leading data-driven method quantifies the cost of not observing the true effect modifier.</w:t>
+      </w:r>
+    </w:p>
+    <w:p>
+      <w:pPr>
+        <w:pStyle w:val="Heading2"/>
+      </w:pPr>
+      <w:r>
+        <w:t>Relevance to CSDA readers</w:t>
+      </w:r>
+    </w:p>
+    <w:p>
+      <w:r>
+        <w:t xml:space="preserve">IONE sits between computational stratification diagnostics and model-based effect modification for individual participant data meta-analysis. C1 applies the </w:t>
+      </w:r>
+      <m:oMath>
+        <m:sSup>
+          <m:e>
+            <m:r>
+              <m:t xml:space="preserve">I</m:t>
+            </m:r>
+          </m:e>
+          <m:sup>
+            <m:r>
+              <m:t xml:space="preserve">2</m:t>
+            </m:r>
+          </m:sup>
+        </m:sSup>
+      </m:oMath>
+      <w:r>
+        <w:t xml:space="preserve"> statistic to discovered strata, and W measures how much CATE variance a partition explains. Both are descriptive sensitivity indices, not inferential tests. The empirical null distribution (Supplementary Table S5) calibrates the diagnostics under no true effect modification, and the misspecification sensitivity (Supplementary Table S6) checks whether </w:t>
       </w:r>
       <m:oMath>
         <m:sSub>
@@ -6011,7 +6301,7 @@
         </m:sSub>
       </m:oMath>
       <w:r>
-        <w:t xml:space="preserve"> value as evidence of an effect modifier without inspecting the fitted outcome model and the empirical null distribution.</w:t>
+        <w:t xml:space="preserve"> is robust to the outcome-model specification. The simulation code, analysis scripts and generated tables are publicly available so readers can reproduce every numerical result.</w:t>
       </w:r>
     </w:p>
     <w:p>
@@ -6019,25 +6309,77 @@
         <w:pStyle w:val="Heading2"/>
       </w:pPr>
       <w:r>
-        <w:t>Large-sample behaviour</w:t>
+        <w:t>Strengths and limitations</w:t>
       </w:r>
     </w:p>
     <w:p>
-      <w:r>
-        <w:t>At n = 10 000 the residual method still showed a non-negligible random-effects ATE bias (0.00864; relative reduction 0.348), similar to the absolute floor observed at n=500 (0.00824) and n=2000 (0.00852). This floor is consistent with the ARI ceiling: once finite-sample error is removed, remaining bias reflects the structural mismatch between the discovered strata and the true CATE surface. The true-CATE-quantile oracle provides an upper bound on what perfect sorting could achieve; the gap between the oracle and the leading data-driven method quantifies the cost of not observing the true effect modifier.</w:t>
+      <w:r/>
+      <w:r>
+        <w:rPr>
+          <w:b/>
+        </w:rPr>
+        <w:t>Strengths.</w:t>
+      </w:r>
+      <w:r>
+        <w:t xml:space="preserve"> The study followed ADEMP </w:t>
+      </w:r>
+      <w:r>
+        <w:rPr>
+          <w:vertAlign w:val="superscript"/>
+        </w:rPr>
+        <w:t>16</w:t>
+      </w:r>
+      <w:r>
+        <w:t>, reported the data-generating mechanism and estimands transparently, and generated all numerical results from version-controlled repository scripts.</w:t>
       </w:r>
     </w:p>
     <w:p>
       <w:pPr>
-        <w:pStyle w:val="Heading2"/>
+        <w:spacing w:before="240"/>
       </w:pPr>
-      <w:r>
-        <w:t>Relevance to CSDA readers</w:t>
-      </w:r>
-    </w:p>
-    <w:p>
-      <w:r>
-        <w:t xml:space="preserve">IONE sits between computational stratification diagnostics and model-based effect modification for individual participant data meta-analysis. C1 re-purposes the </w:t>
+      <w:r/>
+      <w:r>
+        <w:rPr>
+          <w:b/>
+        </w:rPr>
+        <w:t>Limitations.</w:t>
+      </w:r>
+      <w:r>
+        <w:t xml:space="preserve"> The primary scenario used n=2000 and a moderate Z-to-X trace; sensitivity analyses examined K = 3, 5, 10, n = 500 to 10 000, Z-to-Y and Z-to-X scales, and a non-linear mapping, but performance may vary with stronger or weaker signals or fewer studies. The true-Z partition is a constructed reference, so ARI should not be over-interpreted as clinical validity. </w:t>
+      </w:r>
+      <m:oMath>
+        <m:sSub>
+          <m:e>
+            <m:r>
+              <m:t xml:space="preserve">W</m:t>
+            </m:r>
+          </m:e>
+          <m:sub>
+            <m:r>
+              <m:t xml:space="preserve">est</m:t>
+            </m:r>
+          </m:sub>
+        </m:sSub>
+      </m:oMath>
+      <w:r>
+        <w:t xml:space="preserve"> depends on a correctly specified outcome model with interactions; a main-effects-only model can be highly misleading (Supplementary Table S6). DerSimonian-Laird strata are not independent estimates, so the reported </w:t>
+      </w:r>
+      <m:oMath>
+        <m:sSup>
+          <m:e>
+            <m:r>
+              <m:t xml:space="preserve">τ</m:t>
+            </m:r>
+          </m:e>
+          <m:sup>
+            <m:r>
+              <m:t xml:space="preserve">2</m:t>
+            </m:r>
+          </m:sup>
+        </m:sSup>
+      </m:oMath>
+      <w:r>
+        <w:t xml:space="preserve"> and </w:t>
       </w:r>
       <m:oMath>
         <m:sSup>
@@ -6054,7 +6396,228 @@
         </m:sSup>
       </m:oMath>
       <w:r>
-        <w:t xml:space="preserve"> statistic for discovered strata and W connects a partition to explained conditional average treatment effect variance. Both are descriptive sensitivity indices, not inferential tests. The empirical null distribution (Supplementary Table S5) calibrates the diagnostics under no true effect modification, and the misspecification sensitivity (Supplementary Table S6) checks whether </w:t>
+        <w:t xml:space="preserve"> describe between-stratum heterogeneity, not conventional between-study heterogeneity. C1 is computed from log odds ratios while ATE bias is on the risk-difference scale, so it is an indirect diagnostic. Null thresholds (Supplementary Table S5) are method-specific and conditional on the primary DGM. Semi-synthetic examples are pseudo-IPD reconstructions and serve as illustrations, not real-IPD validation.</w:t>
+      </w:r>
+    </w:p>
+    <w:p>
+      <w:pPr>
+        <w:pStyle w:val="Heading1"/>
+      </w:pPr>
+      <w:r>
+        <w:t>5. Conclusions</w:t>
+      </w:r>
+    </w:p>
+    <w:p>
+      <w:r>
+        <w:t>IONE (Incoherence-Oriented Neutralisation and Extraction) is a descriptive sensitivity framework for hidden effect modification in IPD meta-analysis. Monte Carlo simulation and semi-synthetic examples show that the C1 and W diagnostics can flag incoherence, but they do not reliably separate the alternative data-generating mechanism from an empirical null in the primary scenario. When hidden variables leave strong traces in measured covariates, stratification can partially reduce ATE bias, but separating the data into the true hidden subgroups remains difficult. Conventional meta-analytic models and covariate adjustment should remain the primary analysis; C1 and W should be reported alongside them as sensitivity checks. Two concrete recommendations follow: (1) use C1 and W only as descriptive flags, not as inferential tests for hidden effect modification, and (2) pre-specify potential effect modifiers and reserve data-driven stratification for exploratory sensitivity analyses, not for decision-making.</w:t>
+      </w:r>
+    </w:p>
+    <w:p>
+      <w:r>
+        <w:br w:type="page"/>
+      </w:r>
+    </w:p>
+    <w:p>
+      <w:pPr>
+        <w:pStyle w:val="Heading1"/>
+      </w:pPr>
+      <w:r>
+        <w:t>Declarations</w:t>
+      </w:r>
+    </w:p>
+    <w:p>
+      <w:pPr>
+        <w:pStyle w:val="Heading2"/>
+      </w:pPr>
+      <w:r>
+        <w:t>Ethics approval and consent to participate</w:t>
+      </w:r>
+    </w:p>
+    <w:p>
+      <w:r>
+        <w:t>Not applicable. This study used simulated data and publicly available aggregate statistics only.</w:t>
+      </w:r>
+    </w:p>
+    <w:p>
+      <w:pPr>
+        <w:pStyle w:val="Heading2"/>
+      </w:pPr>
+      <w:r>
+        <w:t>Consent for publication</w:t>
+      </w:r>
+    </w:p>
+    <w:p>
+      <w:r>
+        <w:t>Not applicable.</w:t>
+      </w:r>
+    </w:p>
+    <w:p>
+      <w:pPr>
+        <w:pStyle w:val="Heading2"/>
+      </w:pPr>
+      <w:r>
+        <w:t>Availability of data and materials</w:t>
+      </w:r>
+    </w:p>
+    <w:p>
+      <w:r>
+        <w:t xml:space="preserve">All simulation code, analysis scripts, semi-synthetic example data, and the manuscript generator are publicly available at https://github.com/bougtoir/ione-stratification-framework. The repository contains a </w:t>
+      </w:r>
+      <w:r>
+        <w:rPr>
+          <w:rFonts w:ascii="Courier New" w:hAnsi="Courier New"/>
+        </w:rPr>
+        <w:t>requirements.txt</w:t>
+      </w:r>
+      <w:r>
+        <w:t xml:space="preserve"> file and a </w:t>
+      </w:r>
+      <w:r>
+        <w:rPr>
+          <w:rFonts w:ascii="Courier New" w:hAnsi="Courier New"/>
+        </w:rPr>
+        <w:t>requirements-lock.txt</w:t>
+      </w:r>
+      <w:r>
+        <w:t xml:space="preserve"> file with exact package versions, fixed random seeds for every scenario, and </w:t>
+      </w:r>
+      <w:r>
+        <w:rPr>
+          <w:rFonts w:ascii="Courier New" w:hAnsi="Courier New"/>
+        </w:rPr>
+        <w:t>generate_summary.py</w:t>
+      </w:r>
+      <w:r>
+        <w:t xml:space="preserve">, </w:t>
+      </w:r>
+      <w:r>
+        <w:rPr>
+          <w:rFonts w:ascii="Courier New" w:hAnsi="Courier New"/>
+        </w:rPr>
+        <w:t>generate_ione_rsm_v3.py</w:t>
+      </w:r>
+      <w:r>
+        <w:t xml:space="preserve"> and </w:t>
+      </w:r>
+      <w:r>
+        <w:rPr>
+          <w:rFonts w:ascii="Courier New" w:hAnsi="Courier New"/>
+        </w:rPr>
+        <w:t>generate_rsm_tables.py</w:t>
+      </w:r>
+      <w:r>
+        <w:t xml:space="preserve"> scripts that regenerate all manuscript numbers, figures and tables in a Python 3.11 environment. The exact Git commit hash used to create this submission package is recorded in </w:t>
+      </w:r>
+      <w:r>
+        <w:rPr>
+          <w:rFonts w:ascii="Courier New" w:hAnsi="Courier New"/>
+        </w:rPr>
+        <w:t>results/commit_hash.txt</w:t>
+      </w:r>
+      <w:r>
+        <w:t xml:space="preserve">. An archived Zenodo release with a DOI will be created before acceptance to satisfy long-term reproducibility requirements. The published aggregate datasets used for the semi-synthetic illustrations are referenced in the original publications </w:t>
+      </w:r>
+      <w:r>
+        <w:rPr>
+          <w:vertAlign w:val="superscript"/>
+        </w:rPr>
+        <w:t>11</w:t>
+      </w:r>
+      <w:r/>
+      <w:r>
+        <w:rPr>
+          <w:vertAlign w:val="superscript"/>
+        </w:rPr>
+        <w:t>12</w:t>
+      </w:r>
+      <w:r/>
+      <w:r>
+        <w:rPr>
+          <w:vertAlign w:val="superscript"/>
+        </w:rPr>
+        <w:t>13</w:t>
+      </w:r>
+      <w:r/>
+      <w:r>
+        <w:rPr>
+          <w:vertAlign w:val="superscript"/>
+        </w:rPr>
+        <w:t>14</w:t>
+      </w:r>
+      <w:r/>
+      <w:r>
+        <w:rPr>
+          <w:vertAlign w:val="superscript"/>
+        </w:rPr>
+        <w:t>15</w:t>
+      </w:r>
+      <w:r>
+        <w:t>.</w:t>
+      </w:r>
+    </w:p>
+    <w:p>
+      <w:pPr>
+        <w:pStyle w:val="Heading2"/>
+      </w:pPr>
+      <w:r>
+        <w:t>Competing interests</w:t>
+      </w:r>
+    </w:p>
+    <w:p>
+      <w:r>
+        <w:t>The authors declare that they have no competing interests.</w:t>
+      </w:r>
+    </w:p>
+    <w:p>
+      <w:pPr>
+        <w:pStyle w:val="Heading2"/>
+      </w:pPr>
+      <w:r>
+        <w:t>Funding</w:t>
+      </w:r>
+    </w:p>
+    <w:p>
+      <w:r>
+        <w:t>No external funding supported this work.</w:t>
+      </w:r>
+    </w:p>
+    <w:p>
+      <w:pPr>
+        <w:pStyle w:val="Heading2"/>
+      </w:pPr>
+      <w:r>
+        <w:t>Authors' contributions (CRediT taxonomy)</w:t>
+      </w:r>
+    </w:p>
+    <w:p>
+      <w:r>
+        <w:t>Onishi Tatsuki: Conceptualisation, methodology, software, formal analysis, writing – original draft, writing – review and editing, visualisation.</w:t>
+      </w:r>
+    </w:p>
+    <w:p>
+      <w:pPr>
+        <w:pStyle w:val="Heading2"/>
+      </w:pPr>
+      <w:r>
+        <w:t>Acknowledgements</w:t>
+      </w:r>
+    </w:p>
+    <w:p>
+      <w:r>
+        <w:t>Not applicable.</w:t>
+      </w:r>
+    </w:p>
+    <w:p>
+      <w:pPr>
+        <w:pStyle w:val="Heading2"/>
+      </w:pPr>
+      <w:r>
+        <w:t>Supplementary materials</w:t>
+      </w:r>
+    </w:p>
+    <w:p>
+      <w:r>
+        <w:t xml:space="preserve">Supplementary methods, abbreviations, the ADEMP/STROBE-Sim checklists, the four extended sensitivity tables, and the empirical null-distribution and </w:t>
       </w:r>
       <m:oMath>
         <m:sSub>
@@ -6071,7 +6634,16 @@
         </m:sSub>
       </m:oMath>
       <w:r>
-        <w:t xml:space="preserve"> is robust to the outcome-model specification. The simulation code, analysis scripts and generated tables are publicly available so readers can reproduce every numerical result.</w:t>
+        <w:t xml:space="preserve"> misspecification sensitivity tables are provided in </w:t>
+      </w:r>
+      <w:r>
+        <w:rPr>
+          <w:rFonts w:ascii="Courier New" w:hAnsi="Courier New"/>
+        </w:rPr>
+        <w:t>csda_supplementary_v1.docx</w:t>
+      </w:r>
+      <w:r>
+        <w:t>.</w:t>
       </w:r>
     </w:p>
     <w:p>
@@ -6079,94 +6651,17 @@
         <w:pStyle w:val="Heading2"/>
       </w:pPr>
       <w:r>
-        <w:t>Strengths and limitations</w:t>
+        <w:t>Artificial intelligence</w:t>
       </w:r>
     </w:p>
     <w:p>
-      <w:r/>
-      <w:r>
-        <w:rPr>
-          <w:b/>
-        </w:rPr>
-        <w:t>Strengths.</w:t>
-      </w:r>
-      <w:r>
-        <w:t xml:space="preserve"> The study followed ADEMP </w:t>
-      </w:r>
-      <w:r>
-        <w:rPr>
-          <w:vertAlign w:val="superscript"/>
-        </w:rPr>
-        <w:t>16</w:t>
-      </w:r>
-      <w:r>
-        <w:t>, reported the data-generating mechanism and estimands transparently, and generated all numerical results from version-controlled repository scripts.</w:t>
+      <w:r>
+        <w:t>Manuscript text, Python code, and some analyses were drafted or revised using large language models (OpenAI GPT-4 and GPT-4o, accessed August 2025 through August 2026) under the direct, iterative supervision of the author. The LLMs were used for drafting prose, formatting references, generating figures, and implementing the computational pipeline. The author designed the study, wrote the simulation code, selected all references, verified every numerical result against the repository outputs, and approved the final scientific content. No LLM-generated text was used without human review.</w:t>
       </w:r>
     </w:p>
     <w:p>
-      <w:pPr>
-        <w:spacing w:before="240"/>
-      </w:pPr>
-      <w:r/>
-      <w:r>
-        <w:rPr>
-          <w:b/>
-        </w:rPr>
-        <w:t>Limitations.</w:t>
-      </w:r>
-      <w:r>
-        <w:t xml:space="preserve"> The primary scenario used n=2000 and a moderate Z-to-X trace; sensitivity analyses examined K = 3, 5, 10, n = 500 to 10 000, Z-to-Y and Z-to-X scales, and a non-linear mapping, but performance may vary with stronger or weaker signals or fewer studies. The true-Z partition is a constructed reference, so ARI should not be over-interpreted as clinical validity. </w:t>
-      </w:r>
-      <m:oMath>
-        <m:sSub>
-          <m:e>
-            <m:r>
-              <m:t xml:space="preserve">W</m:t>
-            </m:r>
-          </m:e>
-          <m:sub>
-            <m:r>
-              <m:t xml:space="preserve">est</m:t>
-            </m:r>
-          </m:sub>
-        </m:sSub>
-      </m:oMath>
-      <w:r>
-        <w:t xml:space="preserve"> depends on a correctly specified outcome model with interactions; a main-effects-only model can be highly misleading (Supplementary Table S6). DerSimonian-Laird strata are not independent estimates, so the reported </w:t>
-      </w:r>
-      <m:oMath>
-        <m:sSup>
-          <m:e>
-            <m:r>
-              <m:t xml:space="preserve">τ</m:t>
-            </m:r>
-          </m:e>
-          <m:sup>
-            <m:r>
-              <m:t xml:space="preserve">2</m:t>
-            </m:r>
-          </m:sup>
-        </m:sSup>
-      </m:oMath>
-      <w:r>
-        <w:t xml:space="preserve"> and </w:t>
-      </w:r>
-      <m:oMath>
-        <m:sSup>
-          <m:e>
-            <m:r>
-              <m:t xml:space="preserve">I</m:t>
-            </m:r>
-          </m:e>
-          <m:sup>
-            <m:r>
-              <m:t xml:space="preserve">2</m:t>
-            </m:r>
-          </m:sup>
-        </m:sSup>
-      </m:oMath>
-      <w:r>
-        <w:t xml:space="preserve"> describe between-stratum heterogeneity, not conventional between-study heterogeneity. C1 is computed from log odds ratios while ATE bias is on the risk-difference scale, so it is an indirect diagnostic. Null thresholds (Supplementary Table S5) are method-specific and conditional on the primary DGM. Semi-synthetic examples are pseudo-IPD reconstructions and serve as illustrations, not real-IPD validation.</w:t>
+      <w:r>
+        <w:br w:type="page"/>
       </w:r>
     </w:p>
     <w:p>
@@ -6174,322 +6669,57 @@
         <w:pStyle w:val="Heading1"/>
       </w:pPr>
       <w:r>
-        <w:t>5. Conclusions</w:t>
+        <w:t>References</w:t>
       </w:r>
     </w:p>
     <w:p>
       <w:r>
-        <w:t>IONE (Incoherence-Oriented Neutralisation and Extraction) is a descriptive sensitivity framework for hidden effect modification in IPD meta-analysis. Monte Carlo simulation and semi-synthetic examples show that the C1 and W diagnostics can flag incoherence, but they do not reliably separate the alternative data-generating mechanism from an empirical null in the primary scenario. When hidden variables leave strong traces in measured covariates, stratification can partially reduce ATE bias, but separating the data into the true hidden subgroups remains difficult. Conventional meta-analytic models and covariate adjustment should remain the primary analysis; C1 and W should be reported alongside them as sensitivity checks. Two concrete recommendations follow: (1) use C1 and W only as descriptive flags, not as inferential tests for hidden effect modification, and (2) pre-specify potential effect modifiers and reserve data-driven stratification for exploratory sensitivity analyses, not for decision-making.</w:t>
+        <w:t>1. Borenstein M, Hedges LV, Higgins JPT, Rothstein HR. Introduction to Meta-Analysis. Chichester: John Wiley &amp; Sons; 2009. doi: 10.1002/9780470743386</w:t>
       </w:r>
     </w:p>
     <w:p>
       <w:r>
-        <w:br w:type="page"/>
+        <w:t>2. Riley RD, Lambert PC, Abo-Zaid G. Meta-analysis of individual participant data: rationale, conduct, and reporting. BMJ. 2010;340:c221. doi: 10.1136/bmj.c221</w:t>
       </w:r>
     </w:p>
     <w:p>
-      <w:pPr>
-        <w:pStyle w:val="Heading1"/>
-      </w:pPr>
-      <w:r>
-        <w:t>Declarations</w:t>
+      <w:r>
+        <w:t>3. Simmonds MC, Higgins JPT, Stewart LA, Tierney JF, Clarke MJ, Thompson SG. Meta-analysis of individual patient data from randomized trials: a review of methods used in practice. Clin Trials. 2005;2(3):209–217. doi: 10.1191/1740774505cn087oa</w:t>
       </w:r>
     </w:p>
     <w:p>
-      <w:pPr>
-        <w:pStyle w:val="Heading2"/>
-      </w:pPr>
-      <w:r>
-        <w:t>Ethics approval and consent to participate</w:t>
+      <w:r>
+        <w:t>4. DerSimonian R, Laird N. Meta-analysis in clinical trials. Control Clin Trials. 1986;7(3):177–188. doi: 10.1016/0197-2456(86)90046-2</w:t>
       </w:r>
     </w:p>
     <w:p>
       <w:r>
-        <w:t>Not applicable. This study used simulated data and publicly available aggregate statistics only.</w:t>
+        <w:t>5. Higgins JPT, Thompson SG. Quantifying heterogeneity in a meta-analysis. Stat Med. 2002;21(11):1539–1558. doi: 10.1002/sim.1186</w:t>
       </w:r>
     </w:p>
     <w:p>
-      <w:pPr>
-        <w:pStyle w:val="Heading2"/>
-      </w:pPr>
-      <w:r>
-        <w:t>Consent for publication</w:t>
+      <w:r>
+        <w:t>6. Riley RD, Higgins JPT, Deeks JJ. Interpretation of random effects meta-analyses. BMJ. 2011;342:d549.</w:t>
       </w:r>
     </w:p>
     <w:p>
       <w:r>
-        <w:t>Not applicable.</w:t>
+        <w:t>7. Pearl J. Causality. 2nd ed. Cambridge: Cambridge University Press; 2009. doi: 10.1017/cbo9780511803161</w:t>
       </w:r>
     </w:p>
     <w:p>
-      <w:pPr>
-        <w:pStyle w:val="Heading2"/>
-      </w:pPr>
-      <w:r>
-        <w:t>Availability of data and materials</w:t>
+      <w:r>
+        <w:t>8. Greenland S, Robins JM, Pearl J. Confounding and collapsibility in causal inference. Stat Sci. 1999;14(1):29–46. doi: 10.1214/ss/1009211805</w:t>
       </w:r>
     </w:p>
     <w:p>
       <w:r>
-        <w:t xml:space="preserve">All simulation code, analysis scripts, semi-synthetic example data, and the manuscript generator are publicly available at https://github.com/bougtoir/ione-stratification-framework. The repository contains a </w:t>
-      </w:r>
-      <w:r>
-        <w:rPr>
-          <w:rFonts w:ascii="Courier New" w:hAnsi="Courier New"/>
-        </w:rPr>
-        <w:t>requirements.txt</w:t>
-      </w:r>
-      <w:r>
-        <w:t xml:space="preserve"> file and a </w:t>
-      </w:r>
-      <w:r>
-        <w:rPr>
-          <w:rFonts w:ascii="Courier New" w:hAnsi="Courier New"/>
-        </w:rPr>
-        <w:t>requirements-lock.txt</w:t>
-      </w:r>
-      <w:r>
-        <w:t xml:space="preserve"> file with exact package versions, fixed random seeds for every scenario, and </w:t>
-      </w:r>
-      <w:r>
-        <w:rPr>
-          <w:rFonts w:ascii="Courier New" w:hAnsi="Courier New"/>
-        </w:rPr>
-        <w:t>generate_summary.py</w:t>
-      </w:r>
-      <w:r>
-        <w:t xml:space="preserve">, </w:t>
-      </w:r>
-      <w:r>
-        <w:rPr>
-          <w:rFonts w:ascii="Courier New" w:hAnsi="Courier New"/>
-        </w:rPr>
-        <w:t>generate_ione_rsm_v3.py</w:t>
-      </w:r>
-      <w:r>
-        <w:t xml:space="preserve"> and </w:t>
-      </w:r>
-      <w:r>
-        <w:rPr>
-          <w:rFonts w:ascii="Courier New" w:hAnsi="Courier New"/>
-        </w:rPr>
-        <w:t>generate_rsm_tables.py</w:t>
-      </w:r>
-      <w:r>
-        <w:t xml:space="preserve"> scripts that regenerate all manuscript numbers, figures and tables in a Python 3.11 environment. The exact Git commit hash used to create this submission package is recorded in </w:t>
-      </w:r>
-      <w:r>
-        <w:rPr>
-          <w:rFonts w:ascii="Courier New" w:hAnsi="Courier New"/>
-        </w:rPr>
-        <w:t>results/commit_hash.txt</w:t>
-      </w:r>
-      <w:r>
-        <w:t xml:space="preserve">. An archived Zenodo release with a DOI will be created before acceptance to satisfy long-term reproducibility requirements. The published aggregate datasets used for the semi-synthetic illustrations are referenced in the original publications </w:t>
-      </w:r>
-      <w:r>
-        <w:rPr>
-          <w:vertAlign w:val="superscript"/>
-        </w:rPr>
-        <w:t>11</w:t>
-      </w:r>
-      <w:r/>
-      <w:r>
-        <w:rPr>
-          <w:vertAlign w:val="superscript"/>
-        </w:rPr>
-        <w:t>12</w:t>
-      </w:r>
-      <w:r/>
-      <w:r>
-        <w:rPr>
-          <w:vertAlign w:val="superscript"/>
-        </w:rPr>
-        <w:t>13</w:t>
-      </w:r>
-      <w:r/>
-      <w:r>
-        <w:rPr>
-          <w:vertAlign w:val="superscript"/>
-        </w:rPr>
-        <w:t>14</w:t>
-      </w:r>
-      <w:r/>
-      <w:r>
-        <w:rPr>
-          <w:vertAlign w:val="superscript"/>
-        </w:rPr>
-        <w:t>15</w:t>
-      </w:r>
-      <w:r>
-        <w:t>.</w:t>
+        <w:t>9. Simpson EH. The interpretation of interaction in contingency tables. J R Stat Soc Ser B. 1951;13(2):238–241. doi: 10.1111/j.2517-6161.1951.tb00088.x</w:t>
       </w:r>
     </w:p>
     <w:p>
-      <w:pPr>
-        <w:pStyle w:val="Heading2"/>
-      </w:pPr>
-      <w:r>
-        <w:t>Competing interests</w:t>
-      </w:r>
-    </w:p>
-    <w:p>
-      <w:r>
-        <w:t>The authors declare that they have no competing interests.</w:t>
-      </w:r>
-    </w:p>
-    <w:p>
-      <w:pPr>
-        <w:pStyle w:val="Heading2"/>
-      </w:pPr>
-      <w:r>
-        <w:t>Funding</w:t>
-      </w:r>
-    </w:p>
-    <w:p>
-      <w:r>
-        <w:t>No external funding supported this work.</w:t>
-      </w:r>
-    </w:p>
-    <w:p>
-      <w:pPr>
-        <w:pStyle w:val="Heading2"/>
-      </w:pPr>
-      <w:r>
-        <w:t>Authors' contributions (CRediT taxonomy)</w:t>
-      </w:r>
-    </w:p>
-    <w:p>
-      <w:r>
-        <w:t>Onishi Tatsuki: Conceptualisation, methodology, software, formal analysis, writing – original draft, writing – review and editing, visualisation.</w:t>
-      </w:r>
-    </w:p>
-    <w:p>
-      <w:pPr>
-        <w:pStyle w:val="Heading2"/>
-      </w:pPr>
-      <w:r>
-        <w:t>Acknowledgements</w:t>
-      </w:r>
-    </w:p>
-    <w:p>
-      <w:r>
-        <w:t>Not applicable.</w:t>
-      </w:r>
-    </w:p>
-    <w:p>
-      <w:pPr>
-        <w:pStyle w:val="Heading2"/>
-      </w:pPr>
-      <w:r>
-        <w:t>Supplementary materials</w:t>
-      </w:r>
-    </w:p>
-    <w:p>
-      <w:r>
-        <w:t xml:space="preserve">Supplementary methods, abbreviations, the ADEMP/STROBE-Sim checklists, the four extended sensitivity tables, and the empirical null-distribution and </w:t>
-      </w:r>
-      <m:oMath>
-        <m:sSub>
-          <m:e>
-            <m:r>
-              <m:t xml:space="preserve">W</m:t>
-            </m:r>
-          </m:e>
-          <m:sub>
-            <m:r>
-              <m:t xml:space="preserve">est</m:t>
-            </m:r>
-          </m:sub>
-        </m:sSub>
-      </m:oMath>
-      <w:r>
-        <w:t xml:space="preserve"> misspecification sensitivity tables are provided in </w:t>
-      </w:r>
-      <w:r>
-        <w:rPr>
-          <w:rFonts w:ascii="Courier New" w:hAnsi="Courier New"/>
-        </w:rPr>
-        <w:t>csda_supplementary_v1.docx</w:t>
-      </w:r>
-      <w:r>
-        <w:t>.</w:t>
-      </w:r>
-    </w:p>
-    <w:p>
-      <w:pPr>
-        <w:pStyle w:val="Heading2"/>
-      </w:pPr>
-      <w:r>
-        <w:t>Artificial intelligence</w:t>
-      </w:r>
-    </w:p>
-    <w:p>
-      <w:r>
-        <w:t>Manuscript text, Python code, and some analyses were drafted or revised using large language models (OpenAI GPT-4 and GPT-4o, accessed August 2025 through August 2026) under the direct, iterative supervision of the author. The LLMs were used for drafting prose, formatting references, generating figures, and implementing the computational pipeline. The author designed the study, wrote the simulation code, selected all references, verified every numerical result against the repository outputs, and approved the final scientific content. No LLM-generated text was used without human review.</w:t>
-      </w:r>
-    </w:p>
-    <w:p>
-      <w:r>
-        <w:br w:type="page"/>
-      </w:r>
-    </w:p>
-    <w:p>
-      <w:pPr>
-        <w:pStyle w:val="Heading1"/>
-      </w:pPr>
-      <w:r>
-        <w:t>References</w:t>
-      </w:r>
-    </w:p>
-    <w:p>
-      <w:r>
-        <w:t>1. Borenstein M, Hedges LV, Higgins JPT, Rothstein HR. Introduction to Meta-Analysis. Chichester: John Wiley &amp; Sons; 2009. doi: 10.1002/9780470743386</w:t>
-      </w:r>
-    </w:p>
-    <w:p>
-      <w:r>
-        <w:t>2. Riley RD, Lambert PC, Abo-Zaid G. Meta-analysis of individual participant data: rationale, conduct, and reporting. BMJ. 2010;340:c221. doi: 10.1136/bmj.c221</w:t>
-      </w:r>
-    </w:p>
-    <w:p>
-      <w:r>
-        <w:t>3. Simmonds MC, Higgins JPT, Stewart LA, Tierney JF, Clarke MJ, Thompson SG. Meta-analysis of individual patient data from randomized trials: a review of methods used in practice. Clin Trials. 2005;2(3):209–217. doi: 10.1191/1740774505cn087oa</w:t>
-      </w:r>
-    </w:p>
-    <w:p>
-      <w:r>
-        <w:t>4. DerSimonian R, Laird N. Meta-analysis in clinical trials. Control Clin Trials. 1986;7(3):177–188. doi: 10.1016/0197-2456(86)90046-2</w:t>
-      </w:r>
-    </w:p>
-    <w:p>
-      <w:r>
-        <w:t>5. Higgins JPT, Thompson SG. Quantifying heterogeneity in a meta-analysis. Stat Med. 2002;21(11):1539–1558. doi: 10.1002/sim.1186</w:t>
-      </w:r>
-    </w:p>
-    <w:p>
-      <w:r>
-        <w:t>6. Riley RD, Higgins JPT, Deeks JJ. Interpretation of random effects meta-analyses. BMJ. 2011;342:d549.</w:t>
-      </w:r>
-    </w:p>
-    <w:p>
-      <w:r>
-        <w:t>7. Pearl J. Causality. 2nd ed. Cambridge: Cambridge University Press; 2009. doi: 10.1017/cbo9780511803161</w:t>
-      </w:r>
-    </w:p>
-    <w:p>
-      <w:r>
-        <w:t>8. Greenland S, Robins JM, Pearl J. Confounding and collapsibility in causal inference. Stat Sci. 1999;14(1):29–46. doi: 10.1214/ss/1009211805</w:t>
-      </w:r>
-    </w:p>
-    <w:p>
-      <w:r>
-        <w:t>9. Simpson EH. The interpretation of interaction in contingency tables. J R Stat Soc Ser B. 1951;13(2):238–241. doi: 10.1111/j.2517-6161.1951.tb00088.x</w:t>
-      </w:r>
-    </w:p>
-    <w:p>
-      <w:r>
-        <w:t>10. Rojanaworarit C. Misleading epidemiological and statistical evidence in the presence of Simpson's paradox: an illustrative study using simulated scenarios. J Med Life. 2020;13(1):37–44.</w:t>
+      <w:r>
+        <w:t>10. Rojanaworarit C. Misleading epidemiological and statistical evidence in the presence of Simpson's paradox: an illustrative study using simulated scenarios. J Med Life. 2020;13(1):37–44. doi: 10.25122/jml-2019-0120</w:t>
       </w:r>
     </w:p>
     <w:p>

</xml_diff>

<commit_message>
Regenerate summaries, figures and CSDA submission package after 1C removal
Co-Authored-By: Tatsuki Onishi <bougtoir@gmail.com>
</commit_message>
<xml_diff>
--- a/results/manuscript/csda_submission/IONE_csda_v1.docx
+++ b/results/manuscript/csda_submission/IONE_csda_v1.docx
@@ -8,7 +8,7 @@
         <w:jc w:val="left"/>
       </w:pPr>
       <w:r>
-        <w:t>Coherence diagnostics for hidden effect modification in individual participant data meta-analysis: IONE (Incoherence-Oriented Neutralisation and Extraction) and a simulation benchmark of stratification approaches</w:t>
+        <w:t>IONE: Coherence diagnostics for hidden effect modification in individual participant data meta-analysis</w:t>
       </w:r>
     </w:p>
     <w:p>
@@ -372,7 +372,7 @@
         <w:t>Proposed Family 1 (outcome-informed).</w:t>
       </w:r>
       <w:r>
-        <w:t xml:space="preserve"> Method 1A: predicted probability of Y from logistic Y~X, stratified by quantiles. Method 1B: absolute residual from the same model. Method 1C: K-fold cross-validated predictions before stratification.</w:t>
+        <w:t xml:space="preserve"> Method 1A: predicted probability of Y from logistic Y~X, stratified by quantiles. Method 1B: absolute residual from the same model.</w:t>
       </w:r>
     </w:p>
     <w:p>
@@ -1161,6 +1161,114 @@
         <w:pStyle w:val="Heading2"/>
       </w:pPr>
       <w:r>
+        <w:t>Practical recipes for real individual participant data</w:t>
+      </w:r>
+    </w:p>
+    <w:p>
+      <w:r>
+        <w:t xml:space="preserve">In real IPD studies the empirical null must be reconstructed because the true no-modification DGM is unknown. We recommend three operational recipes. (1) </w:t>
+      </w:r>
+      <w:r>
+        <w:rPr>
+          <w:i/>
+        </w:rPr>
+        <w:t>Permutation null</w:t>
+      </w:r>
+      <w:r>
+        <w:t xml:space="preserve">: randomly permute the treatment indicator within studies and re-compute C1 and </w:t>
+      </w:r>
+      <m:oMath>
+        <m:sSub>
+          <m:e>
+            <m:r>
+              <m:t xml:space="preserve">W</m:t>
+            </m:r>
+          </m:e>
+          <m:sub>
+            <m:r>
+              <m:t xml:space="preserve">est</m:t>
+            </m:r>
+          </m:sub>
+        </m:sSub>
+      </m:oMath>
+      <w:r>
+        <w:t xml:space="preserve"> for the chosen stratification. This destroys any true treatment-by-covariate interaction while preserving the covariate distribution and study structure; repeating this B = 200–1000 times yields method-specific null percentiles. (2) </w:t>
+      </w:r>
+      <w:r>
+        <w:rPr>
+          <w:i/>
+        </w:rPr>
+        <w:t>Parametric residual null</w:t>
+      </w:r>
+      <w:r>
+        <w:t xml:space="preserve">: fit the no-modification outcome model Y ~ X + A + study indicators to the data, simulate outcomes from the fitted probabilities, and compute the diagnostics on the simulated data. This null is fast and convenient but relies on the correctness of the main-effects model. (3) </w:t>
+      </w:r>
+      <w:r>
+        <w:rPr>
+          <w:i/>
+        </w:rPr>
+        <w:t>Bootstrap null</w:t>
+      </w:r>
+      <w:r>
+        <w:t xml:space="preserve">: resample participants (or study clusters, when studies are few) with replacement, refit the stratification model, and compute C1 and </w:t>
+      </w:r>
+      <m:oMath>
+        <m:sSub>
+          <m:e>
+            <m:r>
+              <m:t xml:space="preserve">W</m:t>
+            </m:r>
+          </m:e>
+          <m:sub>
+            <m:r>
+              <m:t xml:space="preserve">est</m:t>
+            </m:r>
+          </m:sub>
+        </m:sSub>
+      </m:oMath>
+      <w:r>
+        <w:t xml:space="preserve"> on each bootstrap sample to obtain a sampling null. The excess diagnostics </w:t>
+      </w:r>
+      <m:oMath>
+        <m:sSub>
+          <m:e>
+            <m:r>
+              <m:t xml:space="preserve">C1</m:t>
+            </m:r>
+          </m:e>
+          <m:sub>
+            <m:r>
+              <m:t xml:space="preserve">excess</m:t>
+            </m:r>
+          </m:sub>
+        </m:sSub>
+      </m:oMath>
+      <w:r>
+        <w:t xml:space="preserve"> and </w:t>
+      </w:r>
+      <m:oMath>
+        <m:sSub>
+          <m:e>
+            <m:r>
+              <m:t xml:space="preserve">W</m:t>
+            </m:r>
+          </m:e>
+          <m:sub>
+            <m:r>
+              <m:t xml:space="preserve">est excess</m:t>
+            </m:r>
+          </m:sub>
+        </m:sSub>
+      </m:oMath>
+      <w:r>
+        <w:t xml:space="preserve"> are reported as the observed value minus the mean of the chosen null. We report percentiles in Supplementary Table S5 and recommend cross-checking at least two of the three nulls before interpreting a flag.</w:t>
+      </w:r>
+    </w:p>
+    <w:p>
+      <w:pPr>
+        <w:pStyle w:val="Heading2"/>
+      </w:pPr>
+      <w:r>
         <w:t>True-CATE-quantile oracle reference</w:t>
       </w:r>
     </w:p>
@@ -1289,7 +1397,7 @@
     </w:p>
     <w:p>
       <w:r>
-        <w:t xml:space="preserve">All simulations and manuscript generation were implemented in Python 3.11 using NumPy 2.x, SciPy, scikit-learn 1.5, pandas, statsmodels and python-docx. Pseudo-random numbers were generated with </w:t>
+        <w:t xml:space="preserve">All simulations and manuscript generation were implemented in Python using NumPy, SciPy, scikit-learn, pandas, statsmodels and python-docx. The submission package was generated on a Devin-managed VM with 2 vCPUs (INTEL(R) XEON(R) PLATINUM 8559C), 7.8 GB RAM and Python 3.10.12. Pseudo-random numbers were generated with </w:t>
       </w:r>
       <w:r>
         <w:rPr>
@@ -1409,7 +1517,7 @@
         <w:t>generate_ione_rsm_v3.py</w:t>
       </w:r>
       <w:r>
-        <w:t xml:space="preserve"> regenerate all results, figures, tables and submission files in a Python 3.11 environment with the pinned dependencies.</w:t>
+        <w:t xml:space="preserve"> regenerate all results, figures, tables and submission files in a Python environment with the pinned dependencies.</w:t>
       </w:r>
     </w:p>
     <w:p>
@@ -1935,118 +2043,6 @@
           <w:p>
             <w:r>
               <w:t>0.044</w:t>
-            </w:r>
-          </w:p>
-        </w:tc>
-      </w:tr>
-      <w:tr>
-        <w:tc>
-          <w:tcPr>
-            <w:tcW w:type="dxa" w:w="785"/>
-          </w:tcPr>
-          <w:p>
-            <w:r>
-              <w:t>1C_cv_decision</w:t>
-            </w:r>
-          </w:p>
-        </w:tc>
-        <w:tc>
-          <w:tcPr>
-            <w:tcW w:type="dxa" w:w="785"/>
-          </w:tcPr>
-          <w:p>
-            <w:r>
-              <w:t>0.029</w:t>
-            </w:r>
-          </w:p>
-        </w:tc>
-        <w:tc>
-          <w:tcPr>
-            <w:tcW w:type="dxa" w:w="785"/>
-          </w:tcPr>
-          <w:p>
-            <w:r>
-              <w:t>0.891</w:t>
-            </w:r>
-          </w:p>
-        </w:tc>
-        <w:tc>
-          <w:tcPr>
-            <w:tcW w:type="dxa" w:w="785"/>
-          </w:tcPr>
-          <w:p>
-            <w:r>
-              <w:t>0.352</w:t>
-            </w:r>
-          </w:p>
-        </w:tc>
-        <w:tc>
-          <w:tcPr>
-            <w:tcW w:type="dxa" w:w="785"/>
-          </w:tcPr>
-          <w:p>
-            <w:r>
-              <w:t>0.111</w:t>
-            </w:r>
-          </w:p>
-        </w:tc>
-        <w:tc>
-          <w:tcPr>
-            <w:tcW w:type="dxa" w:w="785"/>
-          </w:tcPr>
-          <w:p>
-            <w:r>
-              <w:t>0.01865</w:t>
-            </w:r>
-          </w:p>
-        </w:tc>
-        <w:tc>
-          <w:tcPr>
-            <w:tcW w:type="dxa" w:w="785"/>
-          </w:tcPr>
-          <w:p>
-            <w:r>
-              <w:t>0.01888</w:t>
-            </w:r>
-          </w:p>
-        </w:tc>
-        <w:tc>
-          <w:tcPr>
-            <w:tcW w:type="dxa" w:w="785"/>
-          </w:tcPr>
-          <w:p>
-            <w:r>
-              <w:t>0.01352</w:t>
-            </w:r>
-          </w:p>
-        </w:tc>
-        <w:tc>
-          <w:tcPr>
-            <w:tcW w:type="dxa" w:w="785"/>
-          </w:tcPr>
-          <w:p>
-            <w:r>
-              <w:t>-0.013</w:t>
-            </w:r>
-          </w:p>
-        </w:tc>
-        <w:tc>
-          <w:tcPr>
-            <w:tcW w:type="dxa" w:w="785"/>
-          </w:tcPr>
-          <w:p>
-            <w:r>
-              <w:t>0.275</w:t>
-            </w:r>
-          </w:p>
-        </w:tc>
-        <w:tc>
-          <w:tcPr>
-            <w:tcW w:type="dxa" w:w="785"/>
-          </w:tcPr>
-          <w:p>
-            <w:r>
-              <w:t>0.142</w:t>
             </w:r>
           </w:p>
         </w:tc>
@@ -4772,58 +4768,6 @@
           </w:tcPr>
           <w:p>
             <w:r>
-              <w:t>1C_cv_decision</w:t>
-            </w:r>
-          </w:p>
-        </w:tc>
-        <w:tc>
-          <w:tcPr>
-            <w:tcW w:type="dxa" w:w="1728"/>
-          </w:tcPr>
-          <w:p>
-            <w:r>
-              <w:t>0.506</w:t>
-            </w:r>
-          </w:p>
-        </w:tc>
-        <w:tc>
-          <w:tcPr>
-            <w:tcW w:type="dxa" w:w="1728"/>
-          </w:tcPr>
-          <w:p>
-            <w:r>
-              <w:t>0.060</w:t>
-            </w:r>
-          </w:p>
-        </w:tc>
-        <w:tc>
-          <w:tcPr>
-            <w:tcW w:type="dxa" w:w="1728"/>
-          </w:tcPr>
-          <w:p>
-            <w:r>
-              <w:t>0.541</w:t>
-            </w:r>
-          </w:p>
-        </w:tc>
-        <w:tc>
-          <w:tcPr>
-            <w:tcW w:type="dxa" w:w="1728"/>
-          </w:tcPr>
-          <w:p>
-            <w:r>
-              <w:t>0.080</w:t>
-            </w:r>
-          </w:p>
-        </w:tc>
-      </w:tr>
-      <w:tr>
-        <w:tc>
-          <w:tcPr>
-            <w:tcW w:type="dxa" w:w="1728"/>
-          </w:tcPr>
-          <w:p>
-            <w:r>
               <w:t>2A_PCA_cum60</w:t>
             </w:r>
           </w:p>
@@ -5672,7 +5616,7 @@
           </w:tcPr>
           <w:p>
             <w:r>
-              <w:t>Strong covariate trace of a hidden modifier and moderate-to-large sample</w:t>
+              <w:t>Strong covariate trace of a hidden modifier and moderate-to-large sample (n ~ 2000)</w:t>
             </w:r>
           </w:p>
         </w:tc>
@@ -5731,7 +5675,7 @@
           </w:tcPr>
           <w:p>
             <w:r>
-              <w:t>Small sample (n ≈ 500) with moderate modification</w:t>
+              <w:t>Small sample (n ~ 500) with moderate modification</w:t>
             </w:r>
           </w:p>
         </w:tc>
@@ -5751,7 +5695,7 @@
           </w:tcPr>
           <w:p>
             <w:r>
-              <w:t>Achieved the largest relative bias reduction and the smallest absolute bias floor at n = 500</w:t>
+              <w:t>Achieved the largest relative bias reduction and the smallest absolute random-effects bias at n = 500</w:t>
             </w:r>
           </w:p>
         </w:tc>
@@ -5761,7 +5705,7 @@
           </w:tcPr>
           <w:p>
             <w:r>
-              <w:t>Relative reduction partly reflects large crude bias; residual model can overfit when events are sparse</w:t>
+              <w:t>Relative reduction partly reflects large crude bias; residual models can overfit when events are sparse</w:t>
             </w:r>
           </w:p>
         </w:tc>
@@ -5773,7 +5717,7 @@
           </w:tcPr>
           <w:p>
             <w:r>
-              <w:t>Large sample (n ≈ 10 000) and strong measured confounding</w:t>
+              <w:t>Large sample (n ~ 10 000) and strong measured confounding</w:t>
             </w:r>
           </w:p>
         </w:tc>
@@ -5783,7 +5727,7 @@
           </w:tcPr>
           <w:p>
             <w:r>
-              <w:t>Propensity-score, prognostic-score or clustering stratification</w:t>
+              <w:t>Prognostic-score or predicted-probability stratification (1A)</w:t>
             </w:r>
           </w:p>
         </w:tc>
@@ -5793,7 +5737,7 @@
           </w:tcPr>
           <w:p>
             <w:r>
-              <w:t>Largest relative reductions after finite-sample error was dominated by structural differences</w:t>
+              <w:t>Largest relative reductions at n = 10 000 once finite-sample error was small</w:t>
             </w:r>
           </w:p>
         </w:tc>
@@ -5803,7 +5747,7 @@
           </w:tcPr>
           <w:p>
             <w:r>
-              <w:t>Residual-based stratification is overtaken once crude bias is small; method-specific performance still varies</w:t>
+              <w:t>Residual-based stratification retains the smallest absolute RE bias; relative reductions become noisy when the crude bias is small; method-specific performance still varies</w:t>
             </w:r>
           </w:p>
         </w:tc>
@@ -5857,7 +5801,7 @@
           </w:tcPr>
           <w:p>
             <w:r>
-              <w:t>Need a descriptive flag for internal incoherence</w:t>
+              <w:t>Need a descriptive flag for internal incoherence in real IPD</w:t>
             </w:r>
           </w:p>
         </w:tc>
@@ -5901,7 +5845,7 @@
               </m:sSub>
             </m:oMath>
             <w:r>
-              <w:t xml:space="preserve"> alongside the primary analysis</w:t>
+              <w:t xml:space="preserve">, calibrated against a permutation or residual null</w:t>
             </w:r>
           </w:p>
         </w:tc>
@@ -5911,7 +5855,7 @@
           </w:tcPr>
           <w:p>
             <w:r>
-              <w:t>Empirically calibrated against a no-modification null</w:t>
+              <w:t>Empirically centred on a no-modification null; use one of the three recipes described in the Methods</w:t>
             </w:r>
           </w:p>
         </w:tc>
@@ -5921,7 +5865,7 @@
           </w:tcPr>
           <w:p>
             <w:r>
-              <w:t>Do not use as a standalone inferential test; thresholds are method-specific and DGM-conditional</w:t>
+              <w:t>Do not use as a standalone inferential test; thresholds are method-specific and DGM-conditional; cross-check at least two nulls</w:t>
             </w:r>
           </w:p>
         </w:tc>
@@ -6699,7 +6643,7 @@
     </w:p>
     <w:p>
       <w:r>
-        <w:t>6. Riley RD, Higgins JPT, Deeks JJ. Interpretation of random effects meta-analyses. BMJ. 2011;342:d549.</w:t>
+        <w:t>6. Riley RD, Higgins JPT, Deeks JJ. Interpretation of random effects meta-analyses. BMJ. 2011;342:d549. doi: 10.1136/bmj.d549</w:t>
       </w:r>
     </w:p>
     <w:p>
@@ -6724,27 +6668,27 @@
     </w:p>
     <w:p>
       <w:r>
-        <w:t>11. Charig CR, Webb DR, Payne SR, Wickham JE. Comparison of treatment of renal calculi by open surgery, percutaneous nephrolithotomy, and extracorporeal shockwave lithotripsy. BMJ. 1986;292(6521):879–882.</w:t>
+        <w:t>11. Charig CR, Webb DR, Payne SR, Wickham JE. Comparison of treatment of renal calculi by open surgery, percutaneous nephrolithotomy, and extracorporeal shockwave lithotripsy. BMJ. 1986;292(6524):879–882. doi: 10.1136/bmj.292.6524.879</w:t>
       </w:r>
     </w:p>
     <w:p>
       <w:r>
-        <w:t>12. Bickel PJ, Hammel EA, O'Connell JW. Sex bias in graduate admissions: data from Berkeley. Science. 1975;187(4175):398–404.</w:t>
+        <w:t>12. Bickel PJ, Hammel EA, O'Connell JW. Sex bias in graduate admissions: data from Berkeley. Science. 1975;187(4175):398–404. doi: 10.1126/science.187.4175.398</w:t>
       </w:r>
     </w:p>
     <w:p>
       <w:r>
-        <w:t>13. von Kügelgen J, Gresele L, Schölkopf B. Simpson's paradox in Covid-19 case fatality rates: a mediation analysis of age-related causal effects. IEEE Trans Artif Intell. 2021;2(1):18–27.</w:t>
+        <w:t>13. von Kügelgen J, Gresele L, Schölkopf B. Simpson's paradox in Covid-19 case fatality rates: a mediation analysis of age-related causal effects. IEEE Trans Artif Intell. 2021;2(1):18–27. doi: 10.1109/TAI.2021.3073088</w:t>
       </w:r>
     </w:p>
     <w:p>
       <w:r>
-        <w:t>14. Haas EJ, Angulo FJ, McLaughlin JM, et al. Impact and effectiveness of mRNA BNT162b2 vaccine against SARS-CoV-2 infections and COVID-19 cases, hospitalisations, and deaths following a nationwide vaccination campaign in Israel: an observational study using national surveillance data. Lancet. 2021;397(10287):1819–1829.</w:t>
+        <w:t>14. Haas EJ, Angulo FJ, McLaughlin JM, et al. Impact and effectiveness of mRNA BNT162b2 vaccine against SARS-CoV-2 infections and COVID-19 cases, hospitalisations, and deaths following a nationwide vaccination campaign in Israel: an observational study using national surveillance data. Lancet. 2021;397(10287):1819–1829. doi: 10.1016/S0140-6736(21)00947-8</w:t>
       </w:r>
     </w:p>
     <w:p>
       <w:r>
-        <w:t>15. Appleton DR, French NR, Vanderpump MP. Ignoring a covariate: an example of Simpson's paradox. Am Stat. 1996;50(4):340–341.</w:t>
+        <w:t>15. Appleton DR, French NR, Vanderpump MP. Ignoring a covariate: an example of Simpson's paradox. Am Stat. 1996;50(4):340–341. doi: 10.1080/00031305.1996.10473563</w:t>
       </w:r>
     </w:p>
     <w:p>

</xml_diff>

<commit_message>
Fix Table 5 n=10000 caveat, declare Python version dynamically, soften Discussion principal findings
Co-Authored-By: Tatsuki Onishi <bougtoir@gmail.com>
</commit_message>
<xml_diff>
--- a/results/manuscript/csda_submission/IONE_csda_v1.docx
+++ b/results/manuscript/csda_submission/IONE_csda_v1.docx
@@ -5737,7 +5737,7 @@
           </w:tcPr>
           <w:p>
             <w:r>
-              <w:t>Largest relative reductions at n = 10 000 once finite-sample error was small</w:t>
+              <w:t>Largest relative reductions and smallest absolute RE biases at n = 10 000 once finite-sample error was small</w:t>
             </w:r>
           </w:p>
         </w:tc>
@@ -5747,7 +5747,7 @@
           </w:tcPr>
           <w:p>
             <w:r>
-              <w:t>Residual-based stratification retains the smallest absolute RE bias; relative reductions become noisy when the crude bias is small; method-specific performance still varies</w:t>
+              <w:t>The residual method remained at its absolute bias floor, so relative reduction alone is not enough to rank methods; choose the metric that matches the clinical question</w:t>
             </w:r>
           </w:p>
         </w:tc>
@@ -6000,7 +6000,7 @@
         </m:sSub>
       </m:oMath>
       <w:r>
-        <w:t xml:space="preserve"> diagnostics did not reliably discriminate the alternative DGM from the empirical null (C1 AUC 0.460-0.545; W AUC 0.427-0.561). Nevertheless, the best data-driven stratification reduced crude ATE bias from 0.01865 to 0.00816 (relative reduction 0.563) with DerSimonian-Laird pooling. These findings show that separating a pooled IPD into more homogeneous strata can partially reduce marginal bias, and that stratum-specific effects should be allowed to vary once incoherence is suggested.</w:t>
+        <w:t xml:space="preserve"> diagnostics did not reliably discriminate the alternative DGM from the empirical null (C1 AUC 0.460-0.545; W AUC 0.427-0.561). Nevertheless, the best data-driven stratification reduced crude ATE bias from 0.01865 to 0.00816 (relative reduction 0.563) with DerSimonian-Laird pooling. These findings show that separating a pooled IPD into more homogeneous strata can reduce some of the marginal bias that is predictable from the measured covariates. For the residual method, DerSimonian-Laird pooling improved over fixed-effect pooling, suggesting that stratum-specific effects should be allowed to vary when the selected partition shows evidence of heterogeneity.</w:t>
       </w:r>
     </w:p>
     <w:p>
@@ -6353,7 +6353,7 @@
     </w:p>
     <w:p>
       <w:r>
-        <w:t>IONE (Incoherence-Oriented Neutralisation and Extraction) is a descriptive sensitivity framework for hidden effect modification in IPD meta-analysis. Monte Carlo simulation and semi-synthetic examples show that the C1 and W diagnostics can flag incoherence, but they do not reliably separate the alternative data-generating mechanism from an empirical null in the primary scenario. When hidden variables leave strong traces in measured covariates, stratification can partially reduce ATE bias, but separating the data into the true hidden subgroups remains difficult. Conventional meta-analytic models and covariate adjustment should remain the primary analysis; C1 and W should be reported alongside them as sensitivity checks. Two concrete recommendations follow: (1) use C1 and W only as descriptive flags, not as inferential tests for hidden effect modification, and (2) pre-specify potential effect modifiers and reserve data-driven stratification for exploratory sensitivity analyses, not for decision-making.</w:t>
+        <w:t>IONE (Incoherence-Oriented Neutralisation and Extraction) is a descriptive sensitivity framework for hidden effect modification in IPD meta-analysis. Monte Carlo simulation and semi-synthetic examples show that the C1 and W diagnostics can flag incoherence, but they do not reliably separate the alternative data-generating mechanism from an empirical null in the primary scenario. When hidden variables leave strong traces in measured covariates, stratification can partially reduce ATE bias, but separating the data into the true hidden subgroups remains difficult. Conventional meta-analytic models and covariate adjustment should remain the primary analysis; C1 and W should be reported alongside them as sensitivity checks. Two practical recommendations are: (1) use C1 and W only as descriptive flags, not as inferential tests for hidden effect modification, and (2) pre-specify potential effect modifiers and reserve data-driven stratification for exploratory sensitivity analyses, not for decision-making.</w:t>
       </w:r>
     </w:p>
     <w:p>
@@ -6450,7 +6450,7 @@
         <w:t>generate_rsm_tables.py</w:t>
       </w:r>
       <w:r>
-        <w:t xml:space="preserve"> scripts that regenerate all manuscript numbers, figures and tables in a Python 3.11 environment. The exact Git commit hash used to create this submission package is recorded in </w:t>
+        <w:t xml:space="preserve"> scripts that regenerate all manuscript numbers, figures and tables in a Python 3.10.12 environment. The exact Git commit hash used to create this submission package is recorded in </w:t>
       </w:r>
       <w:r>
         <w:rPr>

</xml_diff>